<commit_message>
Add questions on open-source vs proprietary and non-US (DeepSeek/Kimi/GLM) vs US models
Co-authored-by: ms4674 <ms4674@users.noreply.github.com>
</commit_message>
<xml_diff>
--- a/LLM_Token_Consumption_Survey.docx
+++ b/LLM_Token_Consumption_Survey.docx
@@ -1345,6 +1345,289 @@
     </w:p>
     <w:p>
       <w:pPr>
+        <w:spacing w:before="200" w:after="40"/>
+      </w:pPr>
+      <w:r>
+        <w:rPr>
+          <w:b/>
+          <w:color w:val="2E6DB4"/>
+          <w:sz w:val="22"/>
+        </w:rPr>
+        <w:t xml:space="preserve">Q9. </w:t>
+      </w:r>
+      <w:r>
+        <w:rPr>
+          <w:b/>
+          <w:color w:val="222222"/>
+          <w:sz w:val="22"/>
+        </w:rPr>
+        <w:t>What is the balance between open-source/open-weight and proprietary (closed) models in your token usage?</w:t>
+      </w:r>
+    </w:p>
+    <w:p>
+      <w:pPr>
+        <w:spacing w:after="20"/>
+        <w:ind w:left="432"/>
+      </w:pPr>
+      <w:r>
+        <w:rPr>
+          <w:sz w:val="22"/>
+        </w:rPr>
+        <w:t xml:space="preserve">☐  </w:t>
+      </w:r>
+      <w:r>
+        <w:rPr>
+          <w:color w:val="333333"/>
+          <w:sz w:val="21"/>
+        </w:rPr>
+        <w:t>Exclusively proprietary / closed models (e.g., GPT, Claude, Gemini)</w:t>
+      </w:r>
+    </w:p>
+    <w:p>
+      <w:pPr>
+        <w:spacing w:after="20"/>
+        <w:ind w:left="432"/>
+      </w:pPr>
+      <w:r>
+        <w:rPr>
+          <w:sz w:val="22"/>
+        </w:rPr>
+        <w:t xml:space="preserve">☐  </w:t>
+      </w:r>
+      <w:r>
+        <w:rPr>
+          <w:color w:val="333333"/>
+          <w:sz w:val="21"/>
+        </w:rPr>
+        <w:t>Mostly proprietary, some open-source (≥ 60% proprietary)</w:t>
+      </w:r>
+    </w:p>
+    <w:p>
+      <w:pPr>
+        <w:spacing w:after="20"/>
+        <w:ind w:left="432"/>
+      </w:pPr>
+      <w:r>
+        <w:rPr>
+          <w:sz w:val="22"/>
+        </w:rPr>
+        <w:t xml:space="preserve">☐  </w:t>
+      </w:r>
+      <w:r>
+        <w:rPr>
+          <w:color w:val="333333"/>
+          <w:sz w:val="21"/>
+        </w:rPr>
+        <w:t>Roughly balanced mix of open-source and proprietary</w:t>
+      </w:r>
+    </w:p>
+    <w:p>
+      <w:pPr>
+        <w:spacing w:after="20"/>
+        <w:ind w:left="432"/>
+      </w:pPr>
+      <w:r>
+        <w:rPr>
+          <w:sz w:val="22"/>
+        </w:rPr>
+        <w:t xml:space="preserve">☐  </w:t>
+      </w:r>
+      <w:r>
+        <w:rPr>
+          <w:color w:val="333333"/>
+          <w:sz w:val="21"/>
+        </w:rPr>
+        <w:t>Mostly open-source / open-weight, some proprietary (≥ 60% open)</w:t>
+      </w:r>
+    </w:p>
+    <w:p>
+      <w:pPr>
+        <w:spacing w:after="20"/>
+        <w:ind w:left="432"/>
+      </w:pPr>
+      <w:r>
+        <w:rPr>
+          <w:sz w:val="22"/>
+        </w:rPr>
+        <w:t xml:space="preserve">☐  </w:t>
+      </w:r>
+      <w:r>
+        <w:rPr>
+          <w:color w:val="333333"/>
+          <w:sz w:val="21"/>
+        </w:rPr>
+        <w:t>Exclusively open-source / open-weight models (e.g., Llama, Mistral, Qwen)</w:t>
+      </w:r>
+    </w:p>
+    <w:p>
+      <w:pPr>
+        <w:spacing w:after="20"/>
+        <w:ind w:left="432"/>
+      </w:pPr>
+      <w:r>
+        <w:rPr>
+          <w:sz w:val="22"/>
+        </w:rPr>
+        <w:t xml:space="preserve">☐  </w:t>
+      </w:r>
+      <w:r>
+        <w:rPr>
+          <w:color w:val="333333"/>
+          <w:sz w:val="21"/>
+        </w:rPr>
+        <w:t>Don't know / not tracked</w:t>
+      </w:r>
+    </w:p>
+    <w:p>
+      <w:pPr>
+        <w:spacing w:before="200" w:after="40"/>
+      </w:pPr>
+      <w:r>
+        <w:rPr>
+          <w:b/>
+          <w:color w:val="2E6DB4"/>
+          <w:sz w:val="22"/>
+        </w:rPr>
+        <w:t xml:space="preserve">Q10. </w:t>
+      </w:r>
+      <w:r>
+        <w:rPr>
+          <w:b/>
+          <w:color w:val="222222"/>
+          <w:sz w:val="22"/>
+        </w:rPr>
+        <w:t>To what extent do you use non-US / Chinese-origin models (e.g., DeepSeek, Kimi, GLM, Qwen) versus US models (e.g., GPT, Claude, Gemini, Llama)?</w:t>
+      </w:r>
+    </w:p>
+    <w:p>
+      <w:pPr>
+        <w:spacing w:after="20"/>
+        <w:ind w:left="432"/>
+      </w:pPr>
+      <w:r>
+        <w:rPr>
+          <w:sz w:val="22"/>
+        </w:rPr>
+        <w:t xml:space="preserve">☐  </w:t>
+      </w:r>
+      <w:r>
+        <w:rPr>
+          <w:color w:val="333333"/>
+          <w:sz w:val="21"/>
+        </w:rPr>
+        <w:t>Exclusively US models</w:t>
+      </w:r>
+    </w:p>
+    <w:p>
+      <w:pPr>
+        <w:spacing w:after="20"/>
+        <w:ind w:left="432"/>
+      </w:pPr>
+      <w:r>
+        <w:rPr>
+          <w:sz w:val="22"/>
+        </w:rPr>
+        <w:t xml:space="preserve">☐  </w:t>
+      </w:r>
+      <w:r>
+        <w:rPr>
+          <w:color w:val="333333"/>
+          <w:sz w:val="21"/>
+        </w:rPr>
+        <w:t>Mostly US models, occasional testing of non-US models</w:t>
+      </w:r>
+    </w:p>
+    <w:p>
+      <w:pPr>
+        <w:spacing w:after="20"/>
+        <w:ind w:left="432"/>
+      </w:pPr>
+      <w:r>
+        <w:rPr>
+          <w:sz w:val="22"/>
+        </w:rPr>
+        <w:t xml:space="preserve">☐  </w:t>
+      </w:r>
+      <w:r>
+        <w:rPr>
+          <w:color w:val="333333"/>
+          <w:sz w:val="21"/>
+        </w:rPr>
+        <w:t>Roughly balanced use of US and non-US models</w:t>
+      </w:r>
+    </w:p>
+    <w:p>
+      <w:pPr>
+        <w:spacing w:after="20"/>
+        <w:ind w:left="432"/>
+      </w:pPr>
+      <w:r>
+        <w:rPr>
+          <w:sz w:val="22"/>
+        </w:rPr>
+        <w:t xml:space="preserve">☐  </w:t>
+      </w:r>
+      <w:r>
+        <w:rPr>
+          <w:color w:val="333333"/>
+          <w:sz w:val="21"/>
+        </w:rPr>
+        <w:t>Mostly non-US / Chinese-origin models</w:t>
+      </w:r>
+    </w:p>
+    <w:p>
+      <w:pPr>
+        <w:spacing w:after="20"/>
+        <w:ind w:left="432"/>
+      </w:pPr>
+      <w:r>
+        <w:rPr>
+          <w:sz w:val="22"/>
+        </w:rPr>
+        <w:t xml:space="preserve">☐  </w:t>
+      </w:r>
+      <w:r>
+        <w:rPr>
+          <w:color w:val="333333"/>
+          <w:sz w:val="21"/>
+        </w:rPr>
+        <w:t>Exclusively non-US / Chinese-origin models</w:t>
+      </w:r>
+    </w:p>
+    <w:p>
+      <w:pPr>
+        <w:spacing w:after="20"/>
+        <w:ind w:left="432"/>
+      </w:pPr>
+      <w:r>
+        <w:rPr>
+          <w:sz w:val="22"/>
+        </w:rPr>
+        <w:t xml:space="preserve">☐  </w:t>
+      </w:r>
+      <w:r>
+        <w:rPr>
+          <w:color w:val="333333"/>
+          <w:sz w:val="21"/>
+        </w:rPr>
+        <w:t>Evaluating non-US models but none in production yet</w:t>
+      </w:r>
+    </w:p>
+    <w:p>
+      <w:pPr>
+        <w:spacing w:after="80"/>
+        <w:ind w:left="432"/>
+      </w:pPr>
+      <w:r>
+        <w:rPr>
+          <w:color w:val="333333"/>
+          <w:sz w:val="21"/>
+        </w:rPr>
+        <w:t>☐  Other (please specify): ____________________________________</w:t>
+      </w:r>
+    </w:p>
+    <w:p>
+      <w:pPr>
         <w:pBdr>
           <w:bottom w:val="single" w:sz="8" w:space="2" w:color="2E6DB4"/>
         </w:pBdr>
@@ -1382,7 +1665,7 @@
           <w:color w:val="2E6DB4"/>
           <w:sz w:val="22"/>
         </w:rPr>
-        <w:t xml:space="preserve">Q9. </w:t>
+        <w:t xml:space="preserve">Q11. </w:t>
       </w:r>
       <w:r>
         <w:rPr>
@@ -2427,7 +2710,7 @@
           <w:color w:val="2E6DB4"/>
           <w:sz w:val="22"/>
         </w:rPr>
-        <w:t xml:space="preserve">Q10. </w:t>
+        <w:t xml:space="preserve">Q12. </w:t>
       </w:r>
       <w:r>
         <w:rPr>
@@ -2581,7 +2864,7 @@
           <w:color w:val="2E6DB4"/>
           <w:sz w:val="22"/>
         </w:rPr>
-        <w:t xml:space="preserve">Q11. </w:t>
+        <w:t xml:space="preserve">Q13. </w:t>
       </w:r>
       <w:r>
         <w:rPr>
@@ -2716,7 +2999,7 @@
           <w:color w:val="2E6DB4"/>
           <w:sz w:val="22"/>
         </w:rPr>
-        <w:t xml:space="preserve">Q12. </w:t>
+        <w:t xml:space="preserve">Q14. </w:t>
       </w:r>
       <w:r>
         <w:rPr>
@@ -2899,7 +3182,7 @@
           <w:color w:val="2E6DB4"/>
           <w:sz w:val="22"/>
         </w:rPr>
-        <w:t xml:space="preserve">Q13. </w:t>
+        <w:t xml:space="preserve">Q15. </w:t>
       </w:r>
       <w:r>
         <w:rPr>
@@ -3053,7 +3336,7 @@
           <w:color w:val="2E6DB4"/>
           <w:sz w:val="22"/>
         </w:rPr>
-        <w:t xml:space="preserve">Q14. </w:t>
+        <w:t xml:space="preserve">Q16. </w:t>
       </w:r>
       <w:r>
         <w:rPr>
@@ -3182,7 +3465,7 @@
           <w:color w:val="2E6DB4"/>
           <w:sz w:val="22"/>
         </w:rPr>
-        <w:t xml:space="preserve">Q15. </w:t>
+        <w:t xml:space="preserve">Q17. </w:t>
       </w:r>
       <w:r>
         <w:rPr>
@@ -3317,7 +3600,7 @@
           <w:color w:val="2E6DB4"/>
           <w:sz w:val="22"/>
         </w:rPr>
-        <w:t xml:space="preserve">Q16. </w:t>
+        <w:t xml:space="preserve">Q18. </w:t>
       </w:r>
       <w:r>
         <w:rPr>
@@ -3452,7 +3735,7 @@
           <w:color w:val="2E6DB4"/>
           <w:sz w:val="22"/>
         </w:rPr>
-        <w:t xml:space="preserve">Q17. </w:t>
+        <w:t xml:space="preserve">Q19. </w:t>
       </w:r>
       <w:r>
         <w:rPr>
@@ -3661,7 +3944,7 @@
           <w:color w:val="2E6DB4"/>
           <w:sz w:val="22"/>
         </w:rPr>
-        <w:t xml:space="preserve">Q18. </w:t>
+        <w:t xml:space="preserve">Q20. </w:t>
       </w:r>
       <w:r>
         <w:rPr>
@@ -3777,7 +4060,7 @@
           <w:color w:val="2E6DB4"/>
           <w:sz w:val="22"/>
         </w:rPr>
-        <w:t xml:space="preserve">Q19. </w:t>
+        <w:t xml:space="preserve">Q21. </w:t>
       </w:r>
       <w:r>
         <w:rPr>
@@ -3912,7 +4195,7 @@
           <w:color w:val="2E6DB4"/>
           <w:sz w:val="22"/>
         </w:rPr>
-        <w:t xml:space="preserve">Q20. </w:t>
+        <w:t xml:space="preserve">Q22. </w:t>
       </w:r>
       <w:r>
         <w:rPr>
@@ -4028,7 +4311,7 @@
           <w:color w:val="2E6DB4"/>
           <w:sz w:val="22"/>
         </w:rPr>
-        <w:t xml:space="preserve">Q21. </w:t>
+        <w:t xml:space="preserve">Q23. </w:t>
       </w:r>
       <w:r>
         <w:rPr>
@@ -4208,7 +4491,7 @@
           <w:color w:val="2E6DB4"/>
           <w:sz w:val="22"/>
         </w:rPr>
-        <w:t xml:space="preserve">Q22. </w:t>
+        <w:t xml:space="preserve">Q24. </w:t>
       </w:r>
       <w:r>
         <w:rPr>
@@ -4343,7 +4626,7 @@
           <w:color w:val="2E6DB4"/>
           <w:sz w:val="22"/>
         </w:rPr>
-        <w:t xml:space="preserve">Q23. </w:t>
+        <w:t xml:space="preserve">Q25. </w:t>
       </w:r>
       <w:r>
         <w:rPr>
@@ -4475,7 +4758,7 @@
           <w:color w:val="2E6DB4"/>
           <w:sz w:val="22"/>
         </w:rPr>
-        <w:t xml:space="preserve">Q24. </w:t>
+        <w:t xml:space="preserve">Q26. </w:t>
       </w:r>
       <w:r>
         <w:rPr>
@@ -4623,7 +4906,7 @@
           <w:color w:val="2E6DB4"/>
           <w:sz w:val="22"/>
         </w:rPr>
-        <w:t xml:space="preserve">Q25. </w:t>
+        <w:t xml:space="preserve">Q27. </w:t>
       </w:r>
       <w:r>
         <w:rPr>
@@ -4758,7 +5041,7 @@
           <w:color w:val="2E6DB4"/>
           <w:sz w:val="22"/>
         </w:rPr>
-        <w:t xml:space="preserve">Q26. </w:t>
+        <w:t xml:space="preserve">Q28. </w:t>
       </w:r>
       <w:r>
         <w:rPr>

</xml_diff>

<commit_message>
Merge new questions (adoption breadth, model mix, token growth, cost governance, ROI) and add multinational question
Co-authored-by: ms4674 <ms4674@users.noreply.github.com>
</commit_message>
<xml_diff>
--- a/LLM_Token_Consumption_Survey.docx
+++ b/LLM_Token_Consumption_Survey.docx
@@ -38,7 +38,7 @@
           <w:color w:val="555555"/>
           <w:sz w:val="21"/>
         </w:rPr>
-        <w:t>Purpose:  This survey measures how organizations consume large language model (LLM) tokens by use case and by sector, your current token budget, and how sensitive your usage is to changes in token pricing. Responses are confidential and will be reported only in aggregate. Estimated completion time: 10–12 minutes.</w:t>
+        <w:t>Purpose:  This survey measures how organizations consume large language model (LLM) tokens by use case and by sector, the model mix you rely on, your current token budget and ROI, and how sensitive your usage is to changes in token pricing. Responses are confidential and will be reported only in aggregate. Estimated completion time: 12–15 minutes.</w:t>
       </w:r>
     </w:p>
     <w:p>
@@ -77,7 +77,7 @@
           <w:color w:val="555555"/>
           <w:sz w:val="20"/>
         </w:rPr>
-        <w:t>Help us segment results by sector, organization size, and your role.</w:t>
+        <w:t>Help us segment results by sector, footprint, organization size, and your role.</w:t>
       </w:r>
     </w:p>
     <w:p>
@@ -303,7 +303,7 @@
           <w:color w:val="222222"/>
           <w:sz w:val="22"/>
         </w:rPr>
-        <w:t>What is the approximate size of your organization (full-time employees)?</w:t>
+        <w:t>Is your organization a multinational (operating in more than one country)?</w:t>
       </w:r>
     </w:p>
     <w:p>
@@ -322,7 +322,7 @@
           <w:color w:val="333333"/>
           <w:sz w:val="21"/>
         </w:rPr>
-        <w:t>1–50 (startup / small business)</w:t>
+        <w:t>Yes — multinational operating across multiple regions worldwide</w:t>
       </w:r>
     </w:p>
     <w:p>
@@ -341,7 +341,7 @@
           <w:color w:val="333333"/>
           <w:sz w:val="21"/>
         </w:rPr>
-        <w:t>51–250 (small-medium)</w:t>
+        <w:t>Yes — operate in a few countries within a single region</w:t>
       </w:r>
     </w:p>
     <w:p>
@@ -360,7 +360,7 @@
           <w:color w:val="333333"/>
           <w:sz w:val="21"/>
         </w:rPr>
-        <w:t>251–1,000 (mid-market)</w:t>
+        <w:t>No — domestic, single-country operations only</w:t>
       </w:r>
     </w:p>
     <w:p>
@@ -379,7 +379,7 @@
           <w:color w:val="333333"/>
           <w:sz w:val="21"/>
         </w:rPr>
-        <w:t>1,001–5,000 (large enterprise)</w:t>
+        <w:t>No — single location / local operations only</w:t>
       </w:r>
     </w:p>
     <w:p>
@@ -398,7 +398,7 @@
           <w:color w:val="333333"/>
           <w:sz w:val="21"/>
         </w:rPr>
-        <w:t>5,001–20,000 (large enterprise)</w:t>
+        <w:t>Planning international expansion (currently domestic)</w:t>
       </w:r>
     </w:p>
     <w:p>
@@ -417,7 +417,7 @@
           <w:color w:val="333333"/>
           <w:sz w:val="21"/>
         </w:rPr>
-        <w:t>More than 20,000 (global enterprise)</w:t>
+        <w:t>Not sure / prefer not to say</w:t>
       </w:r>
     </w:p>
     <w:p>
@@ -438,7 +438,7 @@
           <w:color w:val="222222"/>
           <w:sz w:val="22"/>
         </w:rPr>
-        <w:t>Which best describes your role relative to LLM/AI initiatives?</w:t>
+        <w:t>What is the approximate size of your organization (full-time employees)?</w:t>
       </w:r>
     </w:p>
     <w:p>
@@ -457,7 +457,7 @@
           <w:color w:val="333333"/>
           <w:sz w:val="21"/>
         </w:rPr>
-        <w:t>Executive sponsor / budget owner (CxO, VP)</w:t>
+        <w:t>1–50 (startup / small business)</w:t>
       </w:r>
     </w:p>
     <w:p>
@@ -476,7 +476,7 @@
           <w:color w:val="333333"/>
           <w:sz w:val="21"/>
         </w:rPr>
-        <w:t>Engineering / data science / ML practitioner</w:t>
+        <w:t>51–250 (small-medium)</w:t>
       </w:r>
     </w:p>
     <w:p>
@@ -495,7 +495,7 @@
           <w:color w:val="333333"/>
           <w:sz w:val="21"/>
         </w:rPr>
-        <w:t>Product or program manager for AI features</w:t>
+        <w:t>251–1,000 (mid-market)</w:t>
       </w:r>
     </w:p>
     <w:p>
@@ -514,7 +514,7 @@
           <w:color w:val="333333"/>
           <w:sz w:val="21"/>
         </w:rPr>
-        <w:t>IT, platform, or cloud infrastructure / FinOps</w:t>
+        <w:t>1,001–5,000 (large enterprise)</w:t>
       </w:r>
     </w:p>
     <w:p>
@@ -533,7 +533,7 @@
           <w:color w:val="333333"/>
           <w:sz w:val="21"/>
         </w:rPr>
-        <w:t>Procurement, finance, or vendor management</w:t>
+        <w:t>5,001–20,000 (large enterprise)</w:t>
       </w:r>
     </w:p>
     <w:p>
@@ -552,20 +552,7 @@
           <w:color w:val="333333"/>
           <w:sz w:val="21"/>
         </w:rPr>
-        <w:t>Individual business user of AI tools</w:t>
-      </w:r>
-    </w:p>
-    <w:p>
-      <w:pPr>
-        <w:spacing w:after="80"/>
-        <w:ind w:left="432"/>
-      </w:pPr>
-      <w:r>
-        <w:rPr>
-          <w:color w:val="333333"/>
-          <w:sz w:val="21"/>
-        </w:rPr>
-        <w:t>☐  Other (please specify): ____________________________________</w:t>
+        <w:t>More than 20,000 (global enterprise)</w:t>
       </w:r>
     </w:p>
     <w:p>
@@ -579,6 +566,154 @@
           <w:sz w:val="22"/>
         </w:rPr>
         <w:t xml:space="preserve">Q4. </w:t>
+      </w:r>
+      <w:r>
+        <w:rPr>
+          <w:b/>
+          <w:color w:val="222222"/>
+          <w:sz w:val="22"/>
+        </w:rPr>
+        <w:t>Which best describes your role relative to LLM/AI initiatives?</w:t>
+      </w:r>
+    </w:p>
+    <w:p>
+      <w:pPr>
+        <w:spacing w:after="20"/>
+        <w:ind w:left="432"/>
+      </w:pPr>
+      <w:r>
+        <w:rPr>
+          <w:sz w:val="22"/>
+        </w:rPr>
+        <w:t xml:space="preserve">☐  </w:t>
+      </w:r>
+      <w:r>
+        <w:rPr>
+          <w:color w:val="333333"/>
+          <w:sz w:val="21"/>
+        </w:rPr>
+        <w:t>Executive sponsor / budget owner (CxO, VP)</w:t>
+      </w:r>
+    </w:p>
+    <w:p>
+      <w:pPr>
+        <w:spacing w:after="20"/>
+        <w:ind w:left="432"/>
+      </w:pPr>
+      <w:r>
+        <w:rPr>
+          <w:sz w:val="22"/>
+        </w:rPr>
+        <w:t xml:space="preserve">☐  </w:t>
+      </w:r>
+      <w:r>
+        <w:rPr>
+          <w:color w:val="333333"/>
+          <w:sz w:val="21"/>
+        </w:rPr>
+        <w:t>Engineering / data science / ML practitioner</w:t>
+      </w:r>
+    </w:p>
+    <w:p>
+      <w:pPr>
+        <w:spacing w:after="20"/>
+        <w:ind w:left="432"/>
+      </w:pPr>
+      <w:r>
+        <w:rPr>
+          <w:sz w:val="22"/>
+        </w:rPr>
+        <w:t xml:space="preserve">☐  </w:t>
+      </w:r>
+      <w:r>
+        <w:rPr>
+          <w:color w:val="333333"/>
+          <w:sz w:val="21"/>
+        </w:rPr>
+        <w:t>Product or program manager for AI features</w:t>
+      </w:r>
+    </w:p>
+    <w:p>
+      <w:pPr>
+        <w:spacing w:after="20"/>
+        <w:ind w:left="432"/>
+      </w:pPr>
+      <w:r>
+        <w:rPr>
+          <w:sz w:val="22"/>
+        </w:rPr>
+        <w:t xml:space="preserve">☐  </w:t>
+      </w:r>
+      <w:r>
+        <w:rPr>
+          <w:color w:val="333333"/>
+          <w:sz w:val="21"/>
+        </w:rPr>
+        <w:t>IT, platform, or cloud infrastructure / FinOps</w:t>
+      </w:r>
+    </w:p>
+    <w:p>
+      <w:pPr>
+        <w:spacing w:after="20"/>
+        <w:ind w:left="432"/>
+      </w:pPr>
+      <w:r>
+        <w:rPr>
+          <w:sz w:val="22"/>
+        </w:rPr>
+        <w:t xml:space="preserve">☐  </w:t>
+      </w:r>
+      <w:r>
+        <w:rPr>
+          <w:color w:val="333333"/>
+          <w:sz w:val="21"/>
+        </w:rPr>
+        <w:t>Procurement, finance, or vendor management</w:t>
+      </w:r>
+    </w:p>
+    <w:p>
+      <w:pPr>
+        <w:spacing w:after="20"/>
+        <w:ind w:left="432"/>
+      </w:pPr>
+      <w:r>
+        <w:rPr>
+          <w:sz w:val="22"/>
+        </w:rPr>
+        <w:t xml:space="preserve">☐  </w:t>
+      </w:r>
+      <w:r>
+        <w:rPr>
+          <w:color w:val="333333"/>
+          <w:sz w:val="21"/>
+        </w:rPr>
+        <w:t>Individual business user of AI tools</w:t>
+      </w:r>
+    </w:p>
+    <w:p>
+      <w:pPr>
+        <w:spacing w:after="80"/>
+        <w:ind w:left="432"/>
+      </w:pPr>
+      <w:r>
+        <w:rPr>
+          <w:color w:val="333333"/>
+          <w:sz w:val="21"/>
+        </w:rPr>
+        <w:t>☐  Other (please specify): ____________________________________</w:t>
+      </w:r>
+    </w:p>
+    <w:p>
+      <w:pPr>
+        <w:spacing w:before="200" w:after="40"/>
+      </w:pPr>
+      <w:r>
+        <w:rPr>
+          <w:b/>
+          <w:color w:val="2E6DB4"/>
+          <w:sz w:val="22"/>
+        </w:rPr>
+        <w:t xml:space="preserve">Q5. </w:t>
       </w:r>
       <w:r>
         <w:rPr>
@@ -697,7 +832,7 @@
           <w:color w:val="1F335E"/>
           <w:sz w:val="28"/>
         </w:rPr>
-        <w:t>Section B.  LLM Use Cases &amp; Deployment Model</w:t>
+        <w:t>Section B.  Adoption Breadth &amp; Use Cases</w:t>
       </w:r>
     </w:p>
     <w:p>
@@ -710,7 +845,7 @@
           <w:color w:val="555555"/>
           <w:sz w:val="20"/>
         </w:rPr>
-        <w:t>Tell us where and how you apply LLMs today.</w:t>
+        <w:t>Tell us how broadly generative AI is used and where it is applied.</w:t>
       </w:r>
     </w:p>
     <w:p>
@@ -723,7 +858,7 @@
           <w:color w:val="2E6DB4"/>
           <w:sz w:val="22"/>
         </w:rPr>
-        <w:t xml:space="preserve">Q5. </w:t>
+        <w:t xml:space="preserve">Q6. </w:t>
       </w:r>
       <w:r>
         <w:rPr>
@@ -941,7 +1076,7 @@
           <w:color w:val="2E6DB4"/>
           <w:sz w:val="22"/>
         </w:rPr>
-        <w:t xml:space="preserve">Q6. </w:t>
+        <w:t xml:space="preserve">Q7. </w:t>
       </w:r>
       <w:r>
         <w:rPr>
@@ -949,7 +1084,7 @@
           <w:color w:val="222222"/>
           <w:sz w:val="22"/>
         </w:rPr>
-        <w:t>Which single use case consumes the MOST tokens in your organization?</w:t>
+        <w:t>How widely is generative AI used across your organization today?</w:t>
       </w:r>
     </w:p>
     <w:p>
@@ -968,7 +1103,7 @@
           <w:color w:val="333333"/>
           <w:sz w:val="21"/>
         </w:rPr>
-        <w:t>Customer support / conversational agents</w:t>
+        <w:t>Used by a small group of technical teams only</w:t>
       </w:r>
     </w:p>
     <w:p>
@@ -987,7 +1122,7 @@
           <w:color w:val="333333"/>
           <w:sz w:val="21"/>
         </w:rPr>
-        <w:t>Coding &amp; software development assistants</w:t>
+        <w:t>Used by select business functions</w:t>
       </w:r>
     </w:p>
     <w:p>
@@ -1006,7 +1141,7 @@
           <w:color w:val="333333"/>
           <w:sz w:val="21"/>
         </w:rPr>
-        <w:t>Content &amp; marketing generation</w:t>
+        <w:t>Used across several major departments</w:t>
       </w:r>
     </w:p>
     <w:p>
@@ -1025,7 +1160,7 @@
           <w:color w:val="333333"/>
           <w:sz w:val="21"/>
         </w:rPr>
-        <w:t>RAG / search / knowledge retrieval</w:t>
+        <w:t>Used broadly across most departments</w:t>
       </w:r>
     </w:p>
     <w:p>
@@ -1044,7 +1179,7 @@
           <w:color w:val="333333"/>
           <w:sz w:val="21"/>
         </w:rPr>
-        <w:t>Document &amp; data processing at scale</w:t>
+        <w:t>Embedded into company-wide workflows or products</w:t>
       </w:r>
     </w:p>
     <w:p>
@@ -1063,20 +1198,26 @@
           <w:color w:val="333333"/>
           <w:sz w:val="21"/>
         </w:rPr>
-        <w:t>Agentic / multi-step automation workflows</w:t>
-      </w:r>
-    </w:p>
-    <w:p>
-      <w:pPr>
-        <w:spacing w:after="80"/>
+        <w:t>Not used in any meaningful way</w:t>
+      </w:r>
+    </w:p>
+    <w:p>
+      <w:pPr>
+        <w:spacing w:after="20"/>
         <w:ind w:left="432"/>
       </w:pPr>
+      <w:r>
+        <w:rPr>
+          <w:sz w:val="22"/>
+        </w:rPr>
+        <w:t xml:space="preserve">☐  </w:t>
+      </w:r>
       <w:r>
         <w:rPr>
           <w:color w:val="333333"/>
           <w:sz w:val="21"/>
         </w:rPr>
-        <w:t>☐  Other (please specify): ____________________________________</w:t>
+        <w:t>Don't know</w:t>
       </w:r>
     </w:p>
     <w:p>
@@ -1089,7 +1230,7 @@
           <w:color w:val="2E6DB4"/>
           <w:sz w:val="22"/>
         </w:rPr>
-        <w:t xml:space="preserve">Q7. </w:t>
+        <w:t xml:space="preserve">Q8. </w:t>
       </w:r>
       <w:r>
         <w:rPr>
@@ -1097,7 +1238,7 @@
           <w:color w:val="222222"/>
           <w:sz w:val="22"/>
         </w:rPr>
-        <w:t>How do you primarily access LLM capabilities?</w:t>
+        <w:t>What share of employees use generative AI tools at least weekly?</w:t>
       </w:r>
     </w:p>
     <w:p>
@@ -1116,7 +1257,7 @@
           <w:color w:val="333333"/>
           <w:sz w:val="21"/>
         </w:rPr>
-        <w:t>Commercial API providers (e.g., OpenAI, Anthropic, Google)</w:t>
+        <w:t>Less than 10%</w:t>
       </w:r>
     </w:p>
     <w:p>
@@ -1135,7 +1276,7 @@
           <w:color w:val="333333"/>
           <w:sz w:val="21"/>
         </w:rPr>
-        <w:t>Cloud-hosted models (Azure, AWS Bedrock, Vertex AI)</w:t>
+        <w:t>10% – 25%</w:t>
       </w:r>
     </w:p>
     <w:p>
@@ -1154,7 +1295,7 @@
           <w:color w:val="333333"/>
           <w:sz w:val="21"/>
         </w:rPr>
-        <w:t>Self-hosted open-weight models (Llama, Mistral, Qwen, etc.)</w:t>
+        <w:t>26% – 50%</w:t>
       </w:r>
     </w:p>
     <w:p>
@@ -1173,7 +1314,7 @@
           <w:color w:val="333333"/>
           <w:sz w:val="21"/>
         </w:rPr>
-        <w:t>Packaged SaaS products with embedded LLMs</w:t>
+        <w:t>51% – 75%</w:t>
       </w:r>
     </w:p>
     <w:p>
@@ -1192,20 +1333,26 @@
           <w:color w:val="333333"/>
           <w:sz w:val="21"/>
         </w:rPr>
-        <w:t>A mix of API, self-hosted, and SaaS approaches</w:t>
-      </w:r>
-    </w:p>
-    <w:p>
-      <w:pPr>
-        <w:spacing w:after="80"/>
+        <w:t>More than 75%</w:t>
+      </w:r>
+    </w:p>
+    <w:p>
+      <w:pPr>
+        <w:spacing w:after="20"/>
         <w:ind w:left="432"/>
       </w:pPr>
+      <w:r>
+        <w:rPr>
+          <w:sz w:val="22"/>
+        </w:rPr>
+        <w:t xml:space="preserve">☐  </w:t>
+      </w:r>
       <w:r>
         <w:rPr>
           <w:color w:val="333333"/>
           <w:sz w:val="21"/>
         </w:rPr>
-        <w:t>☐  Other (please specify): ____________________________________</w:t>
+        <w:t>Don't know</w:t>
       </w:r>
     </w:p>
     <w:p>
@@ -1218,7 +1365,7 @@
           <w:color w:val="2E6DB4"/>
           <w:sz w:val="22"/>
         </w:rPr>
-        <w:t xml:space="preserve">Q8. </w:t>
+        <w:t xml:space="preserve">Q9. </w:t>
       </w:r>
       <w:r>
         <w:rPr>
@@ -1226,7 +1373,7 @@
           <w:color w:val="222222"/>
           <w:sz w:val="22"/>
         </w:rPr>
-        <w:t>How many distinct LLM-powered applications/workflows are in production?</w:t>
+        <w:t>Which single use case consumes the MOST tokens in your organization?</w:t>
       </w:r>
     </w:p>
     <w:p>
@@ -1245,7 +1392,7 @@
           <w:color w:val="333333"/>
           <w:sz w:val="21"/>
         </w:rPr>
-        <w:t>None yet (pilots only)</w:t>
+        <w:t>Customer support / conversational agents</w:t>
       </w:r>
     </w:p>
     <w:p>
@@ -1264,7 +1411,7 @@
           <w:color w:val="333333"/>
           <w:sz w:val="21"/>
         </w:rPr>
-        <w:t>1–2</w:t>
+        <w:t>Coding &amp; software development assistants</w:t>
       </w:r>
     </w:p>
     <w:p>
@@ -1283,7 +1430,7 @@
           <w:color w:val="333333"/>
           <w:sz w:val="21"/>
         </w:rPr>
-        <w:t>3–5</w:t>
+        <w:t>Content &amp; marketing generation</w:t>
       </w:r>
     </w:p>
     <w:p>
@@ -1302,7 +1449,7 @@
           <w:color w:val="333333"/>
           <w:sz w:val="21"/>
         </w:rPr>
-        <w:t>6–10</w:t>
+        <w:t>RAG / search / knowledge retrieval</w:t>
       </w:r>
     </w:p>
     <w:p>
@@ -1321,7 +1468,7 @@
           <w:color w:val="333333"/>
           <w:sz w:val="21"/>
         </w:rPr>
-        <w:t>11–25</w:t>
+        <w:t>Document &amp; data processing at scale</w:t>
       </w:r>
     </w:p>
     <w:p>
@@ -1340,7 +1487,20 @@
           <w:color w:val="333333"/>
           <w:sz w:val="21"/>
         </w:rPr>
-        <w:t>More than 25</w:t>
+        <w:t>Agentic / multi-step automation workflows</w:t>
+      </w:r>
+    </w:p>
+    <w:p>
+      <w:pPr>
+        <w:spacing w:after="80"/>
+        <w:ind w:left="432"/>
+      </w:pPr>
+      <w:r>
+        <w:rPr>
+          <w:color w:val="333333"/>
+          <w:sz w:val="21"/>
+        </w:rPr>
+        <w:t>☐  Other (please specify): ____________________________________</w:t>
       </w:r>
     </w:p>
     <w:p>
@@ -1353,7 +1513,7 @@
           <w:color w:val="2E6DB4"/>
           <w:sz w:val="22"/>
         </w:rPr>
-        <w:t xml:space="preserve">Q9. </w:t>
+        <w:t xml:space="preserve">Q10. </w:t>
       </w:r>
       <w:r>
         <w:rPr>
@@ -1361,7 +1521,7 @@
           <w:color w:val="222222"/>
           <w:sz w:val="22"/>
         </w:rPr>
-        <w:t>What is the balance between open-source/open-weight and proprietary (closed) models in your token usage?</w:t>
+        <w:t>How do you primarily access LLM capabilities?</w:t>
       </w:r>
     </w:p>
     <w:p>
@@ -1380,7 +1540,7 @@
           <w:color w:val="333333"/>
           <w:sz w:val="21"/>
         </w:rPr>
-        <w:t>Exclusively proprietary / closed models (e.g., GPT, Claude, Gemini)</w:t>
+        <w:t>Commercial API providers (e.g., OpenAI, Anthropic, Google)</w:t>
       </w:r>
     </w:p>
     <w:p>
@@ -1399,7 +1559,7 @@
           <w:color w:val="333333"/>
           <w:sz w:val="21"/>
         </w:rPr>
-        <w:t>Mostly proprietary, some open-source (≥ 60% proprietary)</w:t>
+        <w:t>Cloud-hosted models (Azure, AWS Bedrock, Vertex AI)</w:t>
       </w:r>
     </w:p>
     <w:p>
@@ -1418,7 +1578,7 @@
           <w:color w:val="333333"/>
           <w:sz w:val="21"/>
         </w:rPr>
-        <w:t>Roughly balanced mix of open-source and proprietary</w:t>
+        <w:t>Self-hosted open-weight models (Llama, Mistral, Qwen, etc.)</w:t>
       </w:r>
     </w:p>
     <w:p>
@@ -1437,7 +1597,7 @@
           <w:color w:val="333333"/>
           <w:sz w:val="21"/>
         </w:rPr>
-        <w:t>Mostly open-source / open-weight, some proprietary (≥ 60% open)</w:t>
+        <w:t>Packaged SaaS products with embedded LLMs</w:t>
       </w:r>
     </w:p>
     <w:p>
@@ -1456,26 +1616,20 @@
           <w:color w:val="333333"/>
           <w:sz w:val="21"/>
         </w:rPr>
-        <w:t>Exclusively open-source / open-weight models (e.g., Llama, Mistral, Qwen)</w:t>
-      </w:r>
-    </w:p>
-    <w:p>
-      <w:pPr>
-        <w:spacing w:after="20"/>
+        <w:t>A mix of API, self-hosted, and SaaS approaches</w:t>
+      </w:r>
+    </w:p>
+    <w:p>
+      <w:pPr>
+        <w:spacing w:after="80"/>
         <w:ind w:left="432"/>
       </w:pPr>
-      <w:r>
-        <w:rPr>
-          <w:sz w:val="22"/>
-        </w:rPr>
-        <w:t xml:space="preserve">☐  </w:t>
-      </w:r>
       <w:r>
         <w:rPr>
           <w:color w:val="333333"/>
           <w:sz w:val="21"/>
         </w:rPr>
-        <w:t>Don't know / not tracked</w:t>
+        <w:t>☐  Other (please specify): ____________________________________</w:t>
       </w:r>
     </w:p>
     <w:p>
@@ -1488,7 +1642,7 @@
           <w:color w:val="2E6DB4"/>
           <w:sz w:val="22"/>
         </w:rPr>
-        <w:t xml:space="preserve">Q10. </w:t>
+        <w:t xml:space="preserve">Q11. </w:t>
       </w:r>
       <w:r>
         <w:rPr>
@@ -1496,7 +1650,7 @@
           <w:color w:val="222222"/>
           <w:sz w:val="22"/>
         </w:rPr>
-        <w:t>To what extent do you use non-US / Chinese-origin models (e.g., DeepSeek, Kimi, GLM, Qwen) versus US models (e.g., GPT, Claude, Gemini, Llama)?</w:t>
+        <w:t>How many distinct LLM-powered applications/workflows are in production?</w:t>
       </w:r>
     </w:p>
     <w:p>
@@ -1515,7 +1669,7 @@
           <w:color w:val="333333"/>
           <w:sz w:val="21"/>
         </w:rPr>
-        <w:t>Exclusively US models</w:t>
+        <w:t>None yet (pilots only)</w:t>
       </w:r>
     </w:p>
     <w:p>
@@ -1534,7 +1688,7 @@
           <w:color w:val="333333"/>
           <w:sz w:val="21"/>
         </w:rPr>
-        <w:t>Mostly US models, occasional testing of non-US models</w:t>
+        <w:t>1–2</w:t>
       </w:r>
     </w:p>
     <w:p>
@@ -1553,7 +1707,7 @@
           <w:color w:val="333333"/>
           <w:sz w:val="21"/>
         </w:rPr>
-        <w:t>Roughly balanced use of US and non-US models</w:t>
+        <w:t>3–5</w:t>
       </w:r>
     </w:p>
     <w:p>
@@ -1572,7 +1726,7 @@
           <w:color w:val="333333"/>
           <w:sz w:val="21"/>
         </w:rPr>
-        <w:t>Mostly non-US / Chinese-origin models</w:t>
+        <w:t>6–10</w:t>
       </w:r>
     </w:p>
     <w:p>
@@ -1591,7 +1745,7 @@
           <w:color w:val="333333"/>
           <w:sz w:val="21"/>
         </w:rPr>
-        <w:t>Exclusively non-US / Chinese-origin models</w:t>
+        <w:t>11–25</w:t>
       </w:r>
     </w:p>
     <w:p>
@@ -1610,20 +1764,7 @@
           <w:color w:val="333333"/>
           <w:sz w:val="21"/>
         </w:rPr>
-        <w:t>Evaluating non-US models but none in production yet</w:t>
-      </w:r>
-    </w:p>
-    <w:p>
-      <w:pPr>
-        <w:spacing w:after="80"/>
-        <w:ind w:left="432"/>
-      </w:pPr>
-      <w:r>
-        <w:rPr>
-          <w:color w:val="333333"/>
-          <w:sz w:val="21"/>
-        </w:rPr>
-        <w:t>☐  Other (please specify): ____________________________________</w:t>
+        <w:t>More than 25</w:t>
       </w:r>
     </w:p>
     <w:p>
@@ -1639,7 +1780,7 @@
           <w:color w:val="1F335E"/>
           <w:sz w:val="28"/>
         </w:rPr>
-        <w:t>Section C.  Token Consumption by Use Case</w:t>
+        <w:t>Section C.  Model Mix &amp; Sourcing</w:t>
       </w:r>
     </w:p>
     <w:p>
@@ -1652,7 +1793,7 @@
           <w:color w:val="555555"/>
           <w:sz w:val="20"/>
         </w:rPr>
-        <w:t>For each use case you operate, estimate the monthly token volume it consumes. Mark one circle per row; leave a row blank if not applicable.</w:t>
+        <w:t>Tell us about the balance of open-source vs proprietary and US vs non-US models.</w:t>
       </w:r>
     </w:p>
     <w:p>
@@ -1665,7 +1806,653 @@
           <w:color w:val="2E6DB4"/>
           <w:sz w:val="22"/>
         </w:rPr>
-        <w:t xml:space="preserve">Q11. </w:t>
+        <w:t xml:space="preserve">Q12. </w:t>
+      </w:r>
+      <w:r>
+        <w:rPr>
+          <w:b/>
+          <w:color w:val="222222"/>
+          <w:sz w:val="22"/>
+        </w:rPr>
+        <w:t>What share of token consumption runs through proprietary/closed models vs open-source, open-weight models?</w:t>
+      </w:r>
+    </w:p>
+    <w:p>
+      <w:pPr>
+        <w:spacing w:after="20"/>
+        <w:ind w:left="432"/>
+      </w:pPr>
+      <w:r>
+        <w:rPr>
+          <w:sz w:val="22"/>
+        </w:rPr>
+        <w:t xml:space="preserve">☐  </w:t>
+      </w:r>
+      <w:r>
+        <w:rPr>
+          <w:color w:val="333333"/>
+          <w:sz w:val="21"/>
+        </w:rPr>
+        <w:t>Mostly open-source / open-weight</w:t>
+      </w:r>
+    </w:p>
+    <w:p>
+      <w:pPr>
+        <w:spacing w:after="20"/>
+        <w:ind w:left="432"/>
+      </w:pPr>
+      <w:r>
+        <w:rPr>
+          <w:sz w:val="22"/>
+        </w:rPr>
+        <w:t xml:space="preserve">☐  </w:t>
+      </w:r>
+      <w:r>
+        <w:rPr>
+          <w:color w:val="333333"/>
+          <w:sz w:val="21"/>
+        </w:rPr>
+        <w:t>Mixed, roughly equal</w:t>
+      </w:r>
+    </w:p>
+    <w:p>
+      <w:pPr>
+        <w:spacing w:after="20"/>
+        <w:ind w:left="432"/>
+      </w:pPr>
+      <w:r>
+        <w:rPr>
+          <w:sz w:val="22"/>
+        </w:rPr>
+        <w:t xml:space="preserve">☐  </w:t>
+      </w:r>
+      <w:r>
+        <w:rPr>
+          <w:color w:val="333333"/>
+          <w:sz w:val="21"/>
+        </w:rPr>
+        <w:t>Mostly proprietary / closed models</w:t>
+      </w:r>
+    </w:p>
+    <w:p>
+      <w:pPr>
+        <w:spacing w:after="20"/>
+        <w:ind w:left="432"/>
+      </w:pPr>
+      <w:r>
+        <w:rPr>
+          <w:sz w:val="22"/>
+        </w:rPr>
+        <w:t xml:space="preserve">☐  </w:t>
+      </w:r>
+      <w:r>
+        <w:rPr>
+          <w:color w:val="333333"/>
+          <w:sz w:val="21"/>
+        </w:rPr>
+        <w:t>Mostly closed models but increasingly moving to open-source</w:t>
+      </w:r>
+    </w:p>
+    <w:p>
+      <w:pPr>
+        <w:spacing w:after="20"/>
+        <w:ind w:left="432"/>
+      </w:pPr>
+      <w:r>
+        <w:rPr>
+          <w:sz w:val="22"/>
+        </w:rPr>
+        <w:t xml:space="preserve">☐  </w:t>
+      </w:r>
+      <w:r>
+        <w:rPr>
+          <w:color w:val="333333"/>
+          <w:sz w:val="21"/>
+        </w:rPr>
+        <w:t>Mostly open-source but increasing use of closed models</w:t>
+      </w:r>
+    </w:p>
+    <w:p>
+      <w:pPr>
+        <w:spacing w:after="20"/>
+        <w:ind w:left="432"/>
+      </w:pPr>
+      <w:r>
+        <w:rPr>
+          <w:sz w:val="22"/>
+        </w:rPr>
+        <w:t xml:space="preserve">☐  </w:t>
+      </w:r>
+      <w:r>
+        <w:rPr>
+          <w:color w:val="333333"/>
+          <w:sz w:val="21"/>
+        </w:rPr>
+        <w:t>Neither / not applicable</w:t>
+      </w:r>
+    </w:p>
+    <w:p>
+      <w:pPr>
+        <w:spacing w:after="20"/>
+        <w:ind w:left="432"/>
+      </w:pPr>
+      <w:r>
+        <w:rPr>
+          <w:sz w:val="22"/>
+        </w:rPr>
+        <w:t xml:space="preserve">☐  </w:t>
+      </w:r>
+      <w:r>
+        <w:rPr>
+          <w:color w:val="333333"/>
+          <w:sz w:val="21"/>
+        </w:rPr>
+        <w:t>Don't know</w:t>
+      </w:r>
+    </w:p>
+    <w:p>
+      <w:pPr>
+        <w:spacing w:before="200" w:after="40"/>
+      </w:pPr>
+      <w:r>
+        <w:rPr>
+          <w:b/>
+          <w:color w:val="2E6DB4"/>
+          <w:sz w:val="22"/>
+        </w:rPr>
+        <w:t xml:space="preserve">Q13. </w:t>
+      </w:r>
+      <w:r>
+        <w:rPr>
+          <w:b/>
+          <w:color w:val="222222"/>
+          <w:sz w:val="22"/>
+        </w:rPr>
+        <w:t>What would be the reasons to increase your use of open-source / open-weight models?</w:t>
+      </w:r>
+    </w:p>
+    <w:p>
+      <w:pPr>
+        <w:spacing w:after="40"/>
+      </w:pPr>
+      <w:r>
+        <w:rPr>
+          <w:i/>
+          <w:color w:val="8A8A8A"/>
+          <w:sz w:val="18"/>
+        </w:rPr>
+        <w:t>(Select all that apply)</w:t>
+      </w:r>
+    </w:p>
+    <w:p>
+      <w:pPr>
+        <w:spacing w:after="20"/>
+        <w:ind w:left="432"/>
+      </w:pPr>
+      <w:r>
+        <w:rPr>
+          <w:sz w:val="22"/>
+        </w:rPr>
+        <w:t xml:space="preserve">☐  </w:t>
+      </w:r>
+      <w:r>
+        <w:rPr>
+          <w:color w:val="333333"/>
+          <w:sz w:val="21"/>
+        </w:rPr>
+        <w:t>Lower inference or token costs</w:t>
+      </w:r>
+    </w:p>
+    <w:p>
+      <w:pPr>
+        <w:spacing w:after="20"/>
+        <w:ind w:left="432"/>
+      </w:pPr>
+      <w:r>
+        <w:rPr>
+          <w:sz w:val="22"/>
+        </w:rPr>
+        <w:t xml:space="preserve">☐  </w:t>
+      </w:r>
+      <w:r>
+        <w:rPr>
+          <w:color w:val="333333"/>
+          <w:sz w:val="21"/>
+        </w:rPr>
+        <w:t>Open models are closing the performance gap with proprietary models</w:t>
+      </w:r>
+    </w:p>
+    <w:p>
+      <w:pPr>
+        <w:spacing w:after="20"/>
+        <w:ind w:left="432"/>
+      </w:pPr>
+      <w:r>
+        <w:rPr>
+          <w:sz w:val="22"/>
+        </w:rPr>
+        <w:t xml:space="preserve">☐  </w:t>
+      </w:r>
+      <w:r>
+        <w:rPr>
+          <w:color w:val="333333"/>
+          <w:sz w:val="21"/>
+        </w:rPr>
+        <w:t>Ability to customize or fine-tune models for internal needs</w:t>
+      </w:r>
+    </w:p>
+    <w:p>
+      <w:pPr>
+        <w:spacing w:after="20"/>
+        <w:ind w:left="432"/>
+      </w:pPr>
+      <w:r>
+        <w:rPr>
+          <w:sz w:val="22"/>
+        </w:rPr>
+        <w:t xml:space="preserve">☐  </w:t>
+      </w:r>
+      <w:r>
+        <w:rPr>
+          <w:color w:val="333333"/>
+          <w:sz w:val="21"/>
+        </w:rPr>
+        <w:t>More transparency into model architecture, weights or behavior</w:t>
+      </w:r>
+    </w:p>
+    <w:p>
+      <w:pPr>
+        <w:spacing w:after="20"/>
+        <w:ind w:left="432"/>
+      </w:pPr>
+      <w:r>
+        <w:rPr>
+          <w:sz w:val="22"/>
+        </w:rPr>
+        <w:t xml:space="preserve">☐  </w:t>
+      </w:r>
+      <w:r>
+        <w:rPr>
+          <w:color w:val="333333"/>
+          <w:sz w:val="21"/>
+        </w:rPr>
+        <w:t>Easier integration into internal developer workflows</w:t>
+      </w:r>
+    </w:p>
+    <w:p>
+      <w:pPr>
+        <w:spacing w:after="20"/>
+        <w:ind w:left="432"/>
+      </w:pPr>
+      <w:r>
+        <w:rPr>
+          <w:sz w:val="22"/>
+        </w:rPr>
+        <w:t xml:space="preserve">☐  </w:t>
+      </w:r>
+      <w:r>
+        <w:rPr>
+          <w:color w:val="333333"/>
+          <w:sz w:val="21"/>
+        </w:rPr>
+        <w:t>Better economics for high-volume, lower-complexity workloads</w:t>
+      </w:r>
+    </w:p>
+    <w:p>
+      <w:pPr>
+        <w:spacing w:after="20"/>
+        <w:ind w:left="432"/>
+      </w:pPr>
+      <w:r>
+        <w:rPr>
+          <w:sz w:val="22"/>
+        </w:rPr>
+        <w:t xml:space="preserve">☐  </w:t>
+      </w:r>
+      <w:r>
+        <w:rPr>
+          <w:color w:val="333333"/>
+          <w:sz w:val="21"/>
+        </w:rPr>
+        <w:t>Building internal AI expertise or strategic capability</w:t>
+      </w:r>
+    </w:p>
+    <w:p>
+      <w:pPr>
+        <w:spacing w:after="20"/>
+        <w:ind w:left="432"/>
+      </w:pPr>
+      <w:r>
+        <w:rPr>
+          <w:sz w:val="22"/>
+        </w:rPr>
+        <w:t xml:space="preserve">☐  </w:t>
+      </w:r>
+      <w:r>
+        <w:rPr>
+          <w:color w:val="333333"/>
+          <w:sz w:val="21"/>
+        </w:rPr>
+        <w:t>Data privacy and security control</w:t>
+      </w:r>
+    </w:p>
+    <w:p>
+      <w:pPr>
+        <w:spacing w:after="80"/>
+        <w:ind w:left="432"/>
+      </w:pPr>
+      <w:r>
+        <w:rPr>
+          <w:color w:val="333333"/>
+          <w:sz w:val="21"/>
+        </w:rPr>
+        <w:t>☐  Other (please specify): ____________________________________</w:t>
+      </w:r>
+    </w:p>
+    <w:p>
+      <w:pPr>
+        <w:spacing w:before="200" w:after="40"/>
+      </w:pPr>
+      <w:r>
+        <w:rPr>
+          <w:b/>
+          <w:color w:val="2E6DB4"/>
+          <w:sz w:val="22"/>
+        </w:rPr>
+        <w:t xml:space="preserve">Q14. </w:t>
+      </w:r>
+      <w:r>
+        <w:rPr>
+          <w:b/>
+          <w:color w:val="222222"/>
+          <w:sz w:val="22"/>
+        </w:rPr>
+        <w:t>To what extent do you use non-US / Chinese-origin models (e.g., DeepSeek, Kimi, GLM, Qwen) versus US models (e.g., GPT, Claude, Gemini, Llama)?</w:t>
+      </w:r>
+    </w:p>
+    <w:p>
+      <w:pPr>
+        <w:spacing w:after="20"/>
+        <w:ind w:left="432"/>
+      </w:pPr>
+      <w:r>
+        <w:rPr>
+          <w:sz w:val="22"/>
+        </w:rPr>
+        <w:t xml:space="preserve">☐  </w:t>
+      </w:r>
+      <w:r>
+        <w:rPr>
+          <w:color w:val="333333"/>
+          <w:sz w:val="21"/>
+        </w:rPr>
+        <w:t>Exclusively US models</w:t>
+      </w:r>
+    </w:p>
+    <w:p>
+      <w:pPr>
+        <w:spacing w:after="20"/>
+        <w:ind w:left="432"/>
+      </w:pPr>
+      <w:r>
+        <w:rPr>
+          <w:sz w:val="22"/>
+        </w:rPr>
+        <w:t xml:space="preserve">☐  </w:t>
+      </w:r>
+      <w:r>
+        <w:rPr>
+          <w:color w:val="333333"/>
+          <w:sz w:val="21"/>
+        </w:rPr>
+        <w:t>Mostly US models, occasional testing of non-US models</w:t>
+      </w:r>
+    </w:p>
+    <w:p>
+      <w:pPr>
+        <w:spacing w:after="20"/>
+        <w:ind w:left="432"/>
+      </w:pPr>
+      <w:r>
+        <w:rPr>
+          <w:sz w:val="22"/>
+        </w:rPr>
+        <w:t xml:space="preserve">☐  </w:t>
+      </w:r>
+      <w:r>
+        <w:rPr>
+          <w:color w:val="333333"/>
+          <w:sz w:val="21"/>
+        </w:rPr>
+        <w:t>Roughly balanced use of US and non-US models</w:t>
+      </w:r>
+    </w:p>
+    <w:p>
+      <w:pPr>
+        <w:spacing w:after="20"/>
+        <w:ind w:left="432"/>
+      </w:pPr>
+      <w:r>
+        <w:rPr>
+          <w:sz w:val="22"/>
+        </w:rPr>
+        <w:t xml:space="preserve">☐  </w:t>
+      </w:r>
+      <w:r>
+        <w:rPr>
+          <w:color w:val="333333"/>
+          <w:sz w:val="21"/>
+        </w:rPr>
+        <w:t>Mostly non-US / Chinese-origin models</w:t>
+      </w:r>
+    </w:p>
+    <w:p>
+      <w:pPr>
+        <w:spacing w:after="20"/>
+        <w:ind w:left="432"/>
+      </w:pPr>
+      <w:r>
+        <w:rPr>
+          <w:sz w:val="22"/>
+        </w:rPr>
+        <w:t xml:space="preserve">☐  </w:t>
+      </w:r>
+      <w:r>
+        <w:rPr>
+          <w:color w:val="333333"/>
+          <w:sz w:val="21"/>
+        </w:rPr>
+        <w:t>Exclusively non-US / Chinese-origin models</w:t>
+      </w:r>
+    </w:p>
+    <w:p>
+      <w:pPr>
+        <w:spacing w:after="20"/>
+        <w:ind w:left="432"/>
+      </w:pPr>
+      <w:r>
+        <w:rPr>
+          <w:sz w:val="22"/>
+        </w:rPr>
+        <w:t xml:space="preserve">☐  </w:t>
+      </w:r>
+      <w:r>
+        <w:rPr>
+          <w:color w:val="333333"/>
+          <w:sz w:val="21"/>
+        </w:rPr>
+        <w:t>Evaluating non-US models but none in production yet</w:t>
+      </w:r>
+    </w:p>
+    <w:p>
+      <w:pPr>
+        <w:spacing w:after="80"/>
+        <w:ind w:left="432"/>
+      </w:pPr>
+      <w:r>
+        <w:rPr>
+          <w:color w:val="333333"/>
+          <w:sz w:val="21"/>
+        </w:rPr>
+        <w:t>☐  Other (please specify): ____________________________________</w:t>
+      </w:r>
+    </w:p>
+    <w:p>
+      <w:pPr>
+        <w:spacing w:before="200" w:after="40"/>
+      </w:pPr>
+      <w:r>
+        <w:rPr>
+          <w:b/>
+          <w:color w:val="2E6DB4"/>
+          <w:sz w:val="22"/>
+        </w:rPr>
+        <w:t xml:space="preserve">Q15. </w:t>
+      </w:r>
+      <w:r>
+        <w:rPr>
+          <w:b/>
+          <w:color w:val="222222"/>
+          <w:sz w:val="22"/>
+        </w:rPr>
+        <w:t>Has your organization shifted token volume toward lower-cost models in the past six months?</w:t>
+      </w:r>
+    </w:p>
+    <w:p>
+      <w:pPr>
+        <w:spacing w:after="20"/>
+        <w:ind w:left="432"/>
+      </w:pPr>
+      <w:r>
+        <w:rPr>
+          <w:sz w:val="22"/>
+        </w:rPr>
+        <w:t xml:space="preserve">☐  </w:t>
+      </w:r>
+      <w:r>
+        <w:rPr>
+          <w:color w:val="333333"/>
+          <w:sz w:val="21"/>
+        </w:rPr>
+        <w:t>Yes, significantly</w:t>
+      </w:r>
+    </w:p>
+    <w:p>
+      <w:pPr>
+        <w:spacing w:after="20"/>
+        <w:ind w:left="432"/>
+      </w:pPr>
+      <w:r>
+        <w:rPr>
+          <w:sz w:val="22"/>
+        </w:rPr>
+        <w:t xml:space="preserve">☐  </w:t>
+      </w:r>
+      <w:r>
+        <w:rPr>
+          <w:color w:val="333333"/>
+          <w:sz w:val="21"/>
+        </w:rPr>
+        <w:t>Yes, somewhat</w:t>
+      </w:r>
+    </w:p>
+    <w:p>
+      <w:pPr>
+        <w:spacing w:after="20"/>
+        <w:ind w:left="432"/>
+      </w:pPr>
+      <w:r>
+        <w:rPr>
+          <w:sz w:val="22"/>
+        </w:rPr>
+        <w:t xml:space="preserve">☐  </w:t>
+      </w:r>
+      <w:r>
+        <w:rPr>
+          <w:color w:val="333333"/>
+          <w:sz w:val="21"/>
+        </w:rPr>
+        <w:t>Not really</w:t>
+      </w:r>
+    </w:p>
+    <w:p>
+      <w:pPr>
+        <w:spacing w:after="20"/>
+        <w:ind w:left="432"/>
+      </w:pPr>
+      <w:r>
+        <w:rPr>
+          <w:sz w:val="22"/>
+        </w:rPr>
+        <w:t xml:space="preserve">☐  </w:t>
+      </w:r>
+      <w:r>
+        <w:rPr>
+          <w:color w:val="333333"/>
+          <w:sz w:val="21"/>
+        </w:rPr>
+        <w:t>We are evaluating it</w:t>
+      </w:r>
+    </w:p>
+    <w:p>
+      <w:pPr>
+        <w:spacing w:after="20"/>
+        <w:ind w:left="432"/>
+      </w:pPr>
+      <w:r>
+        <w:rPr>
+          <w:sz w:val="22"/>
+        </w:rPr>
+        <w:t xml:space="preserve">☐  </w:t>
+      </w:r>
+      <w:r>
+        <w:rPr>
+          <w:color w:val="333333"/>
+          <w:sz w:val="21"/>
+        </w:rPr>
+        <w:t>Don't know</w:t>
+      </w:r>
+    </w:p>
+    <w:p>
+      <w:pPr>
+        <w:pBdr>
+          <w:bottom w:val="single" w:sz="8" w:space="2" w:color="2E6DB4"/>
+        </w:pBdr>
+        <w:spacing w:before="320" w:after="120"/>
+      </w:pPr>
+      <w:r>
+        <w:rPr>
+          <w:b/>
+          <w:color w:val="1F335E"/>
+          <w:sz w:val="28"/>
+        </w:rPr>
+        <w:t>Section D.  Token Consumption by Use Case</w:t>
+      </w:r>
+    </w:p>
+    <w:p>
+      <w:pPr>
+        <w:spacing w:after="160"/>
+      </w:pPr>
+      <w:r>
+        <w:rPr>
+          <w:i/>
+          <w:color w:val="555555"/>
+          <w:sz w:val="20"/>
+        </w:rPr>
+        <w:t>For each use case you operate, estimate the monthly token volume it consumes. Mark one circle per row; leave a row blank if not applicable.</w:t>
+      </w:r>
+    </w:p>
+    <w:p>
+      <w:pPr>
+        <w:spacing w:before="200" w:after="40"/>
+      </w:pPr>
+      <w:r>
+        <w:rPr>
+          <w:b/>
+          <w:color w:val="2E6DB4"/>
+          <w:sz w:val="22"/>
+        </w:rPr>
+        <w:t xml:space="preserve">Q16. </w:t>
       </w:r>
       <w:r>
         <w:rPr>
@@ -2710,7 +3497,7 @@
           <w:color w:val="2E6DB4"/>
           <w:sz w:val="22"/>
         </w:rPr>
-        <w:t xml:space="preserve">Q12. </w:t>
+        <w:t xml:space="preserve">Q17. </w:t>
       </w:r>
       <w:r>
         <w:rPr>
@@ -2864,7 +3651,7 @@
           <w:color w:val="2E6DB4"/>
           <w:sz w:val="22"/>
         </w:rPr>
-        <w:t xml:space="preserve">Q13. </w:t>
+        <w:t xml:space="preserve">Q18. </w:t>
       </w:r>
       <w:r>
         <w:rPr>
@@ -2999,7 +3786,7 @@
           <w:color w:val="2E6DB4"/>
           <w:sz w:val="22"/>
         </w:rPr>
-        <w:t xml:space="preserve">Q14. </w:t>
+        <w:t xml:space="preserve">Q19. </w:t>
       </w:r>
       <w:r>
         <w:rPr>
@@ -3141,6 +3928,192 @@
           <w:sz w:val="21"/>
         </w:rPr>
         <w:t>Not applicable / too new to compare</w:t>
+      </w:r>
+    </w:p>
+    <w:p>
+      <w:pPr>
+        <w:spacing w:before="200" w:after="40"/>
+      </w:pPr>
+      <w:r>
+        <w:rPr>
+          <w:b/>
+          <w:color w:val="2E6DB4"/>
+          <w:sz w:val="22"/>
+        </w:rPr>
+        <w:t xml:space="preserve">Q20. </w:t>
+      </w:r>
+      <w:r>
+        <w:rPr>
+          <w:b/>
+          <w:color w:val="222222"/>
+          <w:sz w:val="22"/>
+        </w:rPr>
+        <w:t>What is the main driver of your token growth?</w:t>
+      </w:r>
+    </w:p>
+    <w:p>
+      <w:pPr>
+        <w:spacing w:after="20"/>
+        <w:ind w:left="432"/>
+      </w:pPr>
+      <w:r>
+        <w:rPr>
+          <w:sz w:val="22"/>
+        </w:rPr>
+        <w:t xml:space="preserve">☐  </w:t>
+      </w:r>
+      <w:r>
+        <w:rPr>
+          <w:color w:val="333333"/>
+          <w:sz w:val="21"/>
+        </w:rPr>
+        <w:t>More users</w:t>
+      </w:r>
+    </w:p>
+    <w:p>
+      <w:pPr>
+        <w:spacing w:after="20"/>
+        <w:ind w:left="432"/>
+      </w:pPr>
+      <w:r>
+        <w:rPr>
+          <w:sz w:val="22"/>
+        </w:rPr>
+        <w:t xml:space="preserve">☐  </w:t>
+      </w:r>
+      <w:r>
+        <w:rPr>
+          <w:color w:val="333333"/>
+          <w:sz w:val="21"/>
+        </w:rPr>
+        <w:t>More AI features in products</w:t>
+      </w:r>
+    </w:p>
+    <w:p>
+      <w:pPr>
+        <w:spacing w:after="20"/>
+        <w:ind w:left="432"/>
+      </w:pPr>
+      <w:r>
+        <w:rPr>
+          <w:sz w:val="22"/>
+        </w:rPr>
+        <w:t xml:space="preserve">☐  </w:t>
+      </w:r>
+      <w:r>
+        <w:rPr>
+          <w:color w:val="333333"/>
+          <w:sz w:val="21"/>
+        </w:rPr>
+        <w:t>More complex prompts</w:t>
+      </w:r>
+    </w:p>
+    <w:p>
+      <w:pPr>
+        <w:spacing w:after="20"/>
+        <w:ind w:left="432"/>
+      </w:pPr>
+      <w:r>
+        <w:rPr>
+          <w:sz w:val="22"/>
+        </w:rPr>
+        <w:t xml:space="preserve">☐  </w:t>
+      </w:r>
+      <w:r>
+        <w:rPr>
+          <w:color w:val="333333"/>
+          <w:sz w:val="21"/>
+        </w:rPr>
+        <w:t>Longer context windows</w:t>
+      </w:r>
+    </w:p>
+    <w:p>
+      <w:pPr>
+        <w:spacing w:after="20"/>
+        <w:ind w:left="432"/>
+      </w:pPr>
+      <w:r>
+        <w:rPr>
+          <w:sz w:val="22"/>
+        </w:rPr>
+        <w:t xml:space="preserve">☐  </w:t>
+      </w:r>
+      <w:r>
+        <w:rPr>
+          <w:color w:val="333333"/>
+          <w:sz w:val="21"/>
+        </w:rPr>
+        <w:t>Agentic workflows</w:t>
+      </w:r>
+    </w:p>
+    <w:p>
+      <w:pPr>
+        <w:spacing w:after="20"/>
+        <w:ind w:left="432"/>
+      </w:pPr>
+      <w:r>
+        <w:rPr>
+          <w:sz w:val="22"/>
+        </w:rPr>
+        <w:t xml:space="preserve">☐  </w:t>
+      </w:r>
+      <w:r>
+        <w:rPr>
+          <w:color w:val="333333"/>
+          <w:sz w:val="21"/>
+        </w:rPr>
+        <w:t>Higher customer adoption</w:t>
+      </w:r>
+    </w:p>
+    <w:p>
+      <w:pPr>
+        <w:spacing w:after="20"/>
+        <w:ind w:left="432"/>
+      </w:pPr>
+      <w:r>
+        <w:rPr>
+          <w:sz w:val="22"/>
+        </w:rPr>
+        <w:t xml:space="preserve">☐  </w:t>
+      </w:r>
+      <w:r>
+        <w:rPr>
+          <w:color w:val="333333"/>
+          <w:sz w:val="21"/>
+        </w:rPr>
+        <w:t>More document-heavy workflows</w:t>
+      </w:r>
+    </w:p>
+    <w:p>
+      <w:pPr>
+        <w:spacing w:after="20"/>
+        <w:ind w:left="432"/>
+      </w:pPr>
+      <w:r>
+        <w:rPr>
+          <w:sz w:val="22"/>
+        </w:rPr>
+        <w:t xml:space="preserve">☐  </w:t>
+      </w:r>
+      <w:r>
+        <w:rPr>
+          <w:color w:val="333333"/>
+          <w:sz w:val="21"/>
+        </w:rPr>
+        <w:t>No growth</w:t>
+      </w:r>
+    </w:p>
+    <w:p>
+      <w:pPr>
+        <w:spacing w:after="80"/>
+        <w:ind w:left="432"/>
+      </w:pPr>
+      <w:r>
+        <w:rPr>
+          <w:color w:val="333333"/>
+          <w:sz w:val="21"/>
+        </w:rPr>
+        <w:t>☐  Other (please specify): ____________________________________</w:t>
       </w:r>
     </w:p>
     <w:p>
@@ -3156,7 +4129,7 @@
           <w:color w:val="1F335E"/>
           <w:sz w:val="28"/>
         </w:rPr>
-        <w:t>Section D.  Current Token / LLM Budget</w:t>
+        <w:t>Section E.  Budget, Cost Control &amp; Tracking</w:t>
       </w:r>
     </w:p>
     <w:p>
@@ -3169,7 +4142,7 @@
           <w:color w:val="555555"/>
           <w:sz w:val="20"/>
         </w:rPr>
-        <w:t>Help us understand the financial scale of your LLM usage.</w:t>
+        <w:t>Help us understand the financial scale of your LLM usage and how you govern it.</w:t>
       </w:r>
     </w:p>
     <w:p>
@@ -3182,7 +4155,7 @@
           <w:color w:val="2E6DB4"/>
           <w:sz w:val="22"/>
         </w:rPr>
-        <w:t xml:space="preserve">Q15. </w:t>
+        <w:t xml:space="preserve">Q21. </w:t>
       </w:r>
       <w:r>
         <w:rPr>
@@ -3336,7 +4309,7 @@
           <w:color w:val="2E6DB4"/>
           <w:sz w:val="22"/>
         </w:rPr>
-        <w:t xml:space="preserve">Q16. </w:t>
+        <w:t xml:space="preserve">Q22. </w:t>
       </w:r>
       <w:r>
         <w:rPr>
@@ -3465,7 +4438,7 @@
           <w:color w:val="2E6DB4"/>
           <w:sz w:val="22"/>
         </w:rPr>
-        <w:t xml:space="preserve">Q17. </w:t>
+        <w:t xml:space="preserve">Q23. </w:t>
       </w:r>
       <w:r>
         <w:rPr>
@@ -3600,7 +4573,7 @@
           <w:color w:val="2E6DB4"/>
           <w:sz w:val="22"/>
         </w:rPr>
-        <w:t xml:space="preserve">Q18. </w:t>
+        <w:t xml:space="preserve">Q24. </w:t>
       </w:r>
       <w:r>
         <w:rPr>
@@ -3735,7 +4708,7 @@
           <w:color w:val="2E6DB4"/>
           <w:sz w:val="22"/>
         </w:rPr>
-        <w:t xml:space="preserve">Q19. </w:t>
+        <w:t xml:space="preserve">Q25. </w:t>
       </w:r>
       <w:r>
         <w:rPr>
@@ -3743,7 +4716,7 @@
           <w:color w:val="222222"/>
           <w:sz w:val="22"/>
         </w:rPr>
-        <w:t>Which methods do you actively use to control or reduce token costs?</w:t>
+        <w:t>How does your organization control or reduce AI token costs and budgets?</w:t>
       </w:r>
     </w:p>
     <w:p>
@@ -3794,7 +4767,7 @@
           <w:color w:val="333333"/>
           <w:sz w:val="21"/>
         </w:rPr>
-        <w:t>Caching (prompt/response caching)</w:t>
+        <w:t>Caching (prompt / response caching)</w:t>
       </w:r>
     </w:p>
     <w:p>
@@ -3813,7 +4786,7 @@
           <w:color w:val="333333"/>
           <w:sz w:val="21"/>
         </w:rPr>
-        <w:t>Routing to smaller / cheaper models where possible</w:t>
+        <w:t>Routing simple tasks to lower-cost / smaller models</w:t>
       </w:r>
     </w:p>
     <w:p>
@@ -3851,7 +4824,7 @@
           <w:color w:val="333333"/>
           <w:sz w:val="21"/>
         </w:rPr>
-        <w:t>Batching, rate limiting, or usage quotas</w:t>
+        <w:t>Fine-tuning / distillation to reduce per-call tokens</w:t>
       </w:r>
     </w:p>
     <w:p>
@@ -3870,7 +4843,7 @@
           <w:color w:val="333333"/>
           <w:sz w:val="21"/>
         </w:rPr>
-        <w:t>Fine-tuning / distillation to reduce per-call tokens</w:t>
+        <w:t>Hard spending caps by team, product or application</w:t>
       </w:r>
     </w:p>
     <w:p>
@@ -3889,7 +4862,339 @@
           <w:color w:val="333333"/>
           <w:sz w:val="21"/>
         </w:rPr>
-        <w:t>No active cost-control measures yet</w:t>
+        <w:t>Usage quotas (daily/weekly) by user, team or business unit</w:t>
+      </w:r>
+    </w:p>
+    <w:p>
+      <w:pPr>
+        <w:spacing w:after="20"/>
+        <w:ind w:left="432"/>
+      </w:pPr>
+      <w:r>
+        <w:rPr>
+          <w:sz w:val="22"/>
+        </w:rPr>
+        <w:t xml:space="preserve">☐  </w:t>
+      </w:r>
+      <w:r>
+        <w:rPr>
+          <w:color w:val="333333"/>
+          <w:sz w:val="21"/>
+        </w:rPr>
+        <w:t>Rate limits on API calls</w:t>
+      </w:r>
+    </w:p>
+    <w:p>
+      <w:pPr>
+        <w:spacing w:after="20"/>
+        <w:ind w:left="432"/>
+      </w:pPr>
+      <w:r>
+        <w:rPr>
+          <w:sz w:val="22"/>
+        </w:rPr>
+        <w:t xml:space="preserve">☐  </w:t>
+      </w:r>
+      <w:r>
+        <w:rPr>
+          <w:color w:val="333333"/>
+          <w:sz w:val="21"/>
+        </w:rPr>
+        <w:t>Limits on prompt / context-window length</w:t>
+      </w:r>
+    </w:p>
+    <w:p>
+      <w:pPr>
+        <w:spacing w:after="20"/>
+        <w:ind w:left="432"/>
+      </w:pPr>
+      <w:r>
+        <w:rPr>
+          <w:sz w:val="22"/>
+        </w:rPr>
+        <w:t xml:space="preserve">☐  </w:t>
+      </w:r>
+      <w:r>
+        <w:rPr>
+          <w:color w:val="333333"/>
+          <w:sz w:val="21"/>
+        </w:rPr>
+        <w:t>Limits on output length</w:t>
+      </w:r>
+    </w:p>
+    <w:p>
+      <w:pPr>
+        <w:spacing w:after="20"/>
+        <w:ind w:left="432"/>
+      </w:pPr>
+      <w:r>
+        <w:rPr>
+          <w:sz w:val="22"/>
+        </w:rPr>
+        <w:t xml:space="preserve">☐  </w:t>
+      </w:r>
+      <w:r>
+        <w:rPr>
+          <w:color w:val="333333"/>
+          <w:sz w:val="21"/>
+        </w:rPr>
+        <w:t>Approval required for high-cost models</w:t>
+      </w:r>
+    </w:p>
+    <w:p>
+      <w:pPr>
+        <w:spacing w:after="20"/>
+        <w:ind w:left="432"/>
+      </w:pPr>
+      <w:r>
+        <w:rPr>
+          <w:sz w:val="22"/>
+        </w:rPr>
+        <w:t xml:space="preserve">☐  </w:t>
+      </w:r>
+      <w:r>
+        <w:rPr>
+          <w:color w:val="333333"/>
+          <w:sz w:val="21"/>
+        </w:rPr>
+        <w:t>Restricting access to approved use cases only</w:t>
+      </w:r>
+    </w:p>
+    <w:p>
+      <w:pPr>
+        <w:spacing w:after="20"/>
+        <w:ind w:left="432"/>
+      </w:pPr>
+      <w:r>
+        <w:rPr>
+          <w:sz w:val="22"/>
+        </w:rPr>
+        <w:t xml:space="preserve">☐  </w:t>
+      </w:r>
+      <w:r>
+        <w:rPr>
+          <w:color w:val="333333"/>
+          <w:sz w:val="21"/>
+        </w:rPr>
+        <w:t>Alerts when spending exceeds a threshold</w:t>
+      </w:r>
+    </w:p>
+    <w:p>
+      <w:pPr>
+        <w:spacing w:after="20"/>
+        <w:ind w:left="432"/>
+      </w:pPr>
+      <w:r>
+        <w:rPr>
+          <w:sz w:val="22"/>
+        </w:rPr>
+        <w:t xml:space="preserve">☐  </w:t>
+      </w:r>
+      <w:r>
+        <w:rPr>
+          <w:color w:val="333333"/>
+          <w:sz w:val="21"/>
+        </w:rPr>
+        <w:t>No formal cost-control or budget measures yet</w:t>
+      </w:r>
+    </w:p>
+    <w:p>
+      <w:pPr>
+        <w:spacing w:after="80"/>
+        <w:ind w:left="432"/>
+      </w:pPr>
+      <w:r>
+        <w:rPr>
+          <w:color w:val="333333"/>
+          <w:sz w:val="21"/>
+        </w:rPr>
+        <w:t>☐  Other (please specify): ____________________________________</w:t>
+      </w:r>
+    </w:p>
+    <w:p>
+      <w:pPr>
+        <w:spacing w:before="200" w:after="40"/>
+      </w:pPr>
+      <w:r>
+        <w:rPr>
+          <w:b/>
+          <w:color w:val="2E6DB4"/>
+          <w:sz w:val="22"/>
+        </w:rPr>
+        <w:t xml:space="preserve">Q26. </w:t>
+      </w:r>
+      <w:r>
+        <w:rPr>
+          <w:b/>
+          <w:color w:val="222222"/>
+          <w:sz w:val="22"/>
+        </w:rPr>
+        <w:t>What tools does your organization use to track AI token usage and spending?</w:t>
+      </w:r>
+    </w:p>
+    <w:p>
+      <w:pPr>
+        <w:spacing w:after="40"/>
+      </w:pPr>
+      <w:r>
+        <w:rPr>
+          <w:i/>
+          <w:color w:val="8A8A8A"/>
+          <w:sz w:val="18"/>
+        </w:rPr>
+        <w:t>(Select all that apply)</w:t>
+      </w:r>
+    </w:p>
+    <w:p>
+      <w:pPr>
+        <w:spacing w:after="20"/>
+        <w:ind w:left="432"/>
+      </w:pPr>
+      <w:r>
+        <w:rPr>
+          <w:sz w:val="22"/>
+        </w:rPr>
+        <w:t xml:space="preserve">☐  </w:t>
+      </w:r>
+      <w:r>
+        <w:rPr>
+          <w:color w:val="333333"/>
+          <w:sz w:val="21"/>
+        </w:rPr>
+        <w:t>Dashboards from AI model providers</w:t>
+      </w:r>
+    </w:p>
+    <w:p>
+      <w:pPr>
+        <w:spacing w:after="20"/>
+        <w:ind w:left="432"/>
+      </w:pPr>
+      <w:r>
+        <w:rPr>
+          <w:sz w:val="22"/>
+        </w:rPr>
+        <w:t xml:space="preserve">☐  </w:t>
+      </w:r>
+      <w:r>
+        <w:rPr>
+          <w:color w:val="333333"/>
+          <w:sz w:val="21"/>
+        </w:rPr>
+        <w:t>Cloud cost-management tools</w:t>
+      </w:r>
+    </w:p>
+    <w:p>
+      <w:pPr>
+        <w:spacing w:after="20"/>
+        <w:ind w:left="432"/>
+      </w:pPr>
+      <w:r>
+        <w:rPr>
+          <w:sz w:val="22"/>
+        </w:rPr>
+        <w:t xml:space="preserve">☐  </w:t>
+      </w:r>
+      <w:r>
+        <w:rPr>
+          <w:color w:val="333333"/>
+          <w:sz w:val="21"/>
+        </w:rPr>
+        <w:t>Internal data dashboards or BI tools</w:t>
+      </w:r>
+    </w:p>
+    <w:p>
+      <w:pPr>
+        <w:spacing w:after="20"/>
+        <w:ind w:left="432"/>
+      </w:pPr>
+      <w:r>
+        <w:rPr>
+          <w:sz w:val="22"/>
+        </w:rPr>
+        <w:t xml:space="preserve">☐  </w:t>
+      </w:r>
+      <w:r>
+        <w:rPr>
+          <w:color w:val="333333"/>
+          <w:sz w:val="21"/>
+        </w:rPr>
+        <w:t>Observability or application-performance monitoring tools</w:t>
+      </w:r>
+    </w:p>
+    <w:p>
+      <w:pPr>
+        <w:spacing w:after="20"/>
+        <w:ind w:left="432"/>
+      </w:pPr>
+      <w:r>
+        <w:rPr>
+          <w:sz w:val="22"/>
+        </w:rPr>
+        <w:t xml:space="preserve">☐  </w:t>
+      </w:r>
+      <w:r>
+        <w:rPr>
+          <w:color w:val="333333"/>
+          <w:sz w:val="21"/>
+        </w:rPr>
+        <w:t>API logs</w:t>
+      </w:r>
+    </w:p>
+    <w:p>
+      <w:pPr>
+        <w:spacing w:after="20"/>
+        <w:ind w:left="432"/>
+      </w:pPr>
+      <w:r>
+        <w:rPr>
+          <w:sz w:val="22"/>
+        </w:rPr>
+        <w:t xml:space="preserve">☐  </w:t>
+      </w:r>
+      <w:r>
+        <w:rPr>
+          <w:color w:val="333333"/>
+          <w:sz w:val="21"/>
+        </w:rPr>
+        <w:t>Spreadsheets or manual reporting</w:t>
+      </w:r>
+    </w:p>
+    <w:p>
+      <w:pPr>
+        <w:spacing w:after="20"/>
+        <w:ind w:left="432"/>
+      </w:pPr>
+      <w:r>
+        <w:rPr>
+          <w:sz w:val="22"/>
+        </w:rPr>
+        <w:t xml:space="preserve">☐  </w:t>
+      </w:r>
+      <w:r>
+        <w:rPr>
+          <w:color w:val="333333"/>
+          <w:sz w:val="21"/>
+        </w:rPr>
+        <w:t>Procurement or finance systems</w:t>
+      </w:r>
+    </w:p>
+    <w:p>
+      <w:pPr>
+        <w:spacing w:after="20"/>
+        <w:ind w:left="432"/>
+      </w:pPr>
+      <w:r>
+        <w:rPr>
+          <w:sz w:val="22"/>
+        </w:rPr>
+        <w:t xml:space="preserve">☐  </w:t>
+      </w:r>
+      <w:r>
+        <w:rPr>
+          <w:color w:val="333333"/>
+          <w:sz w:val="21"/>
+        </w:rPr>
+        <w:t>We do not track token usage</w:t>
       </w:r>
     </w:p>
     <w:p>
@@ -3918,7 +5223,7 @@
           <w:color w:val="1F335E"/>
           <w:sz w:val="28"/>
         </w:rPr>
-        <w:t>Section E.  Sensitivity to Token Pricing</w:t>
+        <w:t>Section F.  Sensitivity to Token Pricing</w:t>
       </w:r>
     </w:p>
     <w:p>
@@ -3944,7 +5249,7 @@
           <w:color w:val="2E6DB4"/>
           <w:sz w:val="22"/>
         </w:rPr>
-        <w:t xml:space="preserve">Q20. </w:t>
+        <w:t xml:space="preserve">Q27. </w:t>
       </w:r>
       <w:r>
         <w:rPr>
@@ -4060,7 +5365,7 @@
           <w:color w:val="2E6DB4"/>
           <w:sz w:val="22"/>
         </w:rPr>
-        <w:t xml:space="preserve">Q21. </w:t>
+        <w:t xml:space="preserve">Q28. </w:t>
       </w:r>
       <w:r>
         <w:rPr>
@@ -4195,7 +5500,7 @@
           <w:color w:val="2E6DB4"/>
           <w:sz w:val="22"/>
         </w:rPr>
-        <w:t xml:space="preserve">Q22. </w:t>
+        <w:t xml:space="preserve">Q29. </w:t>
       </w:r>
       <w:r>
         <w:rPr>
@@ -4311,7 +5616,7 @@
           <w:color w:val="2E6DB4"/>
           <w:sz w:val="22"/>
         </w:rPr>
-        <w:t xml:space="preserve">Q23. </w:t>
+        <w:t xml:space="preserve">Q30. </w:t>
       </w:r>
       <w:r>
         <w:rPr>
@@ -4491,7 +5796,7 @@
           <w:color w:val="2E6DB4"/>
           <w:sz w:val="22"/>
         </w:rPr>
-        <w:t xml:space="preserve">Q24. </w:t>
+        <w:t xml:space="preserve">Q31. </w:t>
       </w:r>
       <w:r>
         <w:rPr>
@@ -4626,7 +5931,7 @@
           <w:color w:val="2E6DB4"/>
           <w:sz w:val="22"/>
         </w:rPr>
-        <w:t xml:space="preserve">Q25. </w:t>
+        <w:t xml:space="preserve">Q32. </w:t>
       </w:r>
       <w:r>
         <w:rPr>
@@ -4745,7 +6050,20 @@
           <w:color w:val="1F335E"/>
           <w:sz w:val="28"/>
         </w:rPr>
-        <w:t>Section F.  Outlook &amp; Open Feedback</w:t>
+        <w:t>Section G.  ROI &amp; Measurement</w:t>
+      </w:r>
+    </w:p>
+    <w:p>
+      <w:pPr>
+        <w:spacing w:after="160"/>
+      </w:pPr>
+      <w:r>
+        <w:rPr>
+          <w:i/>
+          <w:color w:val="555555"/>
+          <w:sz w:val="20"/>
+        </w:rPr>
+        <w:t>Help us understand how you measure the value of your token spend.</w:t>
       </w:r>
     </w:p>
     <w:p>
@@ -4758,7 +6076,7 @@
           <w:color w:val="2E6DB4"/>
           <w:sz w:val="22"/>
         </w:rPr>
-        <w:t xml:space="preserve">Q26. </w:t>
+        <w:t xml:space="preserve">Q33. </w:t>
       </w:r>
       <w:r>
         <w:rPr>
@@ -4766,7 +6084,7 @@
           <w:color w:val="222222"/>
           <w:sz w:val="22"/>
         </w:rPr>
-        <w:t>What is the single biggest barrier to scaling your LLM usage?</w:t>
+        <w:t>How accurately can your organization measure ROI from AI token consumption?</w:t>
       </w:r>
     </w:p>
     <w:p>
@@ -4785,7 +6103,7 @@
           <w:color w:val="333333"/>
           <w:sz w:val="21"/>
         </w:rPr>
-        <w:t>Token / usage cost</w:t>
+        <w:t>We can measure ROI directly with high confidence</w:t>
       </w:r>
     </w:p>
     <w:p>
@@ -4804,7 +6122,7 @@
           <w:color w:val="333333"/>
           <w:sz w:val="21"/>
         </w:rPr>
-        <w:t>Model accuracy or reliability</w:t>
+        <w:t>We can estimate ROI using operational proxies</w:t>
       </w:r>
     </w:p>
     <w:p>
@@ -4823,7 +6141,7 @@
           <w:color w:val="333333"/>
           <w:sz w:val="21"/>
         </w:rPr>
-        <w:t>Data privacy, security &amp; compliance</w:t>
+        <w:t>We track token costs but only loosely connect them to outcomes</w:t>
       </w:r>
     </w:p>
     <w:p>
@@ -4842,7 +6160,7 @@
           <w:color w:val="333333"/>
           <w:sz w:val="21"/>
         </w:rPr>
-        <w:t>Integration &amp; engineering effort</w:t>
+        <w:t>We track AI usage but not token-level cost</w:t>
       </w:r>
     </w:p>
     <w:p>
@@ -4861,7 +6179,7 @@
           <w:color w:val="333333"/>
           <w:sz w:val="21"/>
         </w:rPr>
-        <w:t>Lack of internal skills / talent</w:t>
+        <w:t>We do not measure ROI</w:t>
       </w:r>
     </w:p>
     <w:p>
@@ -4880,20 +6198,7 @@
           <w:color w:val="333333"/>
           <w:sz w:val="21"/>
         </w:rPr>
-        <w:t>Unclear ROI / business case</w:t>
-      </w:r>
-    </w:p>
-    <w:p>
-      <w:pPr>
-        <w:spacing w:after="80"/>
-        <w:ind w:left="432"/>
-      </w:pPr>
-      <w:r>
-        <w:rPr>
-          <w:color w:val="333333"/>
-          <w:sz w:val="21"/>
-        </w:rPr>
-        <w:t>☐  Other (please specify): ____________________________________</w:t>
+        <w:t>Don't know</w:t>
       </w:r>
     </w:p>
     <w:p>
@@ -4906,7 +6211,7 @@
           <w:color w:val="2E6DB4"/>
           <w:sz w:val="22"/>
         </w:rPr>
-        <w:t xml:space="preserve">Q27. </w:t>
+        <w:t xml:space="preserve">Q34. </w:t>
       </w:r>
       <w:r>
         <w:rPr>
@@ -4914,7 +6219,20 @@
           <w:color w:val="222222"/>
           <w:sz w:val="22"/>
         </w:rPr>
-        <w:t>Over the next 2–3 years, what do you expect for token prices in the market?</w:t>
+        <w:t>What proxy do you use to assess whether token spending is worthwhile?</w:t>
+      </w:r>
+    </w:p>
+    <w:p>
+      <w:pPr>
+        <w:spacing w:after="40"/>
+      </w:pPr>
+      <w:r>
+        <w:rPr>
+          <w:i/>
+          <w:color w:val="8A8A8A"/>
+          <w:sz w:val="18"/>
+        </w:rPr>
+        <w:t>(Select all that apply)</w:t>
       </w:r>
     </w:p>
     <w:p>
@@ -4933,7 +6251,7 @@
           <w:color w:val="333333"/>
           <w:sz w:val="21"/>
         </w:rPr>
-        <w:t>Fall significantly (more than 50%)</w:t>
+        <w:t>Cost per completed workflow</w:t>
       </w:r>
     </w:p>
     <w:p>
@@ -4952,7 +6270,7 @@
           <w:color w:val="333333"/>
           <w:sz w:val="21"/>
         </w:rPr>
-        <w:t>Fall moderately (10–50%)</w:t>
+        <w:t>Cost per active AI user</w:t>
       </w:r>
     </w:p>
     <w:p>
@@ -4971,7 +6289,7 @@
           <w:color w:val="333333"/>
           <w:sz w:val="21"/>
         </w:rPr>
-        <w:t>Stay roughly flat</w:t>
+        <w:t>Cost per customer interaction</w:t>
       </w:r>
     </w:p>
     <w:p>
@@ -4990,7 +6308,7 @@
           <w:color w:val="333333"/>
           <w:sz w:val="21"/>
         </w:rPr>
-        <w:t>Rise moderately (10–50%)</w:t>
+        <w:t>Cost per document processed</w:t>
       </w:r>
     </w:p>
     <w:p>
@@ -5009,7 +6327,7 @@
           <w:color w:val="333333"/>
           <w:sz w:val="21"/>
         </w:rPr>
-        <w:t>Rise significantly (more than 50%)</w:t>
+        <w:t>Cost per code change, pull request or deployment</w:t>
       </w:r>
     </w:p>
     <w:p>
@@ -5028,7 +6346,93 @@
           <w:color w:val="333333"/>
           <w:sz w:val="21"/>
         </w:rPr>
-        <w:t>No clear expectation</w:t>
+        <w:t>Change in customer satisfaction or response time</w:t>
+      </w:r>
+    </w:p>
+    <w:p>
+      <w:pPr>
+        <w:spacing w:after="20"/>
+        <w:ind w:left="432"/>
+      </w:pPr>
+      <w:r>
+        <w:rPr>
+          <w:sz w:val="22"/>
+        </w:rPr>
+        <w:t xml:space="preserve">☐  </w:t>
+      </w:r>
+      <w:r>
+        <w:rPr>
+          <w:color w:val="333333"/>
+          <w:sz w:val="21"/>
+        </w:rPr>
+        <w:t>Revenue or usage tied to AI-enabled features</w:t>
+      </w:r>
+    </w:p>
+    <w:p>
+      <w:pPr>
+        <w:spacing w:after="20"/>
+        <w:ind w:left="432"/>
+      </w:pPr>
+      <w:r>
+        <w:rPr>
+          <w:sz w:val="22"/>
+        </w:rPr>
+        <w:t xml:space="preserve">☐  </w:t>
+      </w:r>
+      <w:r>
+        <w:rPr>
+          <w:color w:val="333333"/>
+          <w:sz w:val="21"/>
+        </w:rPr>
+        <w:t>Gross margin impact of AI-enabled features</w:t>
+      </w:r>
+    </w:p>
+    <w:p>
+      <w:pPr>
+        <w:spacing w:after="20"/>
+        <w:ind w:left="432"/>
+      </w:pPr>
+      <w:r>
+        <w:rPr>
+          <w:sz w:val="22"/>
+        </w:rPr>
+        <w:t xml:space="preserve">☐  </w:t>
+      </w:r>
+      <w:r>
+        <w:rPr>
+          <w:color w:val="333333"/>
+          <w:sz w:val="21"/>
+        </w:rPr>
+        <w:t>We do not use formal ROI proxies</w:t>
+      </w:r>
+    </w:p>
+    <w:p>
+      <w:pPr>
+        <w:spacing w:after="80"/>
+        <w:ind w:left="432"/>
+      </w:pPr>
+      <w:r>
+        <w:rPr>
+          <w:color w:val="333333"/>
+          <w:sz w:val="21"/>
+        </w:rPr>
+        <w:t>☐  Other (please specify): ____________________________________</w:t>
+      </w:r>
+    </w:p>
+    <w:p>
+      <w:pPr>
+        <w:pBdr>
+          <w:bottom w:val="single" w:sz="8" w:space="2" w:color="2E6DB4"/>
+        </w:pBdr>
+        <w:spacing w:before="320" w:after="120"/>
+      </w:pPr>
+      <w:r>
+        <w:rPr>
+          <w:b/>
+          <w:color w:val="1F335E"/>
+          <w:sz w:val="28"/>
+        </w:rPr>
+        <w:t>Section H.  Outlook &amp; Open Feedback</w:t>
       </w:r>
     </w:p>
     <w:p>
@@ -5041,7 +6445,7 @@
           <w:color w:val="2E6DB4"/>
           <w:sz w:val="22"/>
         </w:rPr>
-        <w:t xml:space="preserve">Q28. </w:t>
+        <w:t xml:space="preserve">Q35. </w:t>
       </w:r>
       <w:r>
         <w:rPr>
@@ -5049,7 +6453,290 @@
           <w:color w:val="222222"/>
           <w:sz w:val="22"/>
         </w:rPr>
-        <w:t>Any additional comments on your token consumption, budget, or pricing sensitivity? (optional)</w:t>
+        <w:t>What is the single biggest barrier to scaling your LLM usage?</w:t>
+      </w:r>
+    </w:p>
+    <w:p>
+      <w:pPr>
+        <w:spacing w:after="20"/>
+        <w:ind w:left="432"/>
+      </w:pPr>
+      <w:r>
+        <w:rPr>
+          <w:sz w:val="22"/>
+        </w:rPr>
+        <w:t xml:space="preserve">☐  </w:t>
+      </w:r>
+      <w:r>
+        <w:rPr>
+          <w:color w:val="333333"/>
+          <w:sz w:val="21"/>
+        </w:rPr>
+        <w:t>Token / usage cost</w:t>
+      </w:r>
+    </w:p>
+    <w:p>
+      <w:pPr>
+        <w:spacing w:after="20"/>
+        <w:ind w:left="432"/>
+      </w:pPr>
+      <w:r>
+        <w:rPr>
+          <w:sz w:val="22"/>
+        </w:rPr>
+        <w:t xml:space="preserve">☐  </w:t>
+      </w:r>
+      <w:r>
+        <w:rPr>
+          <w:color w:val="333333"/>
+          <w:sz w:val="21"/>
+        </w:rPr>
+        <w:t>Model accuracy or reliability</w:t>
+      </w:r>
+    </w:p>
+    <w:p>
+      <w:pPr>
+        <w:spacing w:after="20"/>
+        <w:ind w:left="432"/>
+      </w:pPr>
+      <w:r>
+        <w:rPr>
+          <w:sz w:val="22"/>
+        </w:rPr>
+        <w:t xml:space="preserve">☐  </w:t>
+      </w:r>
+      <w:r>
+        <w:rPr>
+          <w:color w:val="333333"/>
+          <w:sz w:val="21"/>
+        </w:rPr>
+        <w:t>Data privacy, security &amp; compliance</w:t>
+      </w:r>
+    </w:p>
+    <w:p>
+      <w:pPr>
+        <w:spacing w:after="20"/>
+        <w:ind w:left="432"/>
+      </w:pPr>
+      <w:r>
+        <w:rPr>
+          <w:sz w:val="22"/>
+        </w:rPr>
+        <w:t xml:space="preserve">☐  </w:t>
+      </w:r>
+      <w:r>
+        <w:rPr>
+          <w:color w:val="333333"/>
+          <w:sz w:val="21"/>
+        </w:rPr>
+        <w:t>Integration &amp; engineering effort</w:t>
+      </w:r>
+    </w:p>
+    <w:p>
+      <w:pPr>
+        <w:spacing w:after="20"/>
+        <w:ind w:left="432"/>
+      </w:pPr>
+      <w:r>
+        <w:rPr>
+          <w:sz w:val="22"/>
+        </w:rPr>
+        <w:t xml:space="preserve">☐  </w:t>
+      </w:r>
+      <w:r>
+        <w:rPr>
+          <w:color w:val="333333"/>
+          <w:sz w:val="21"/>
+        </w:rPr>
+        <w:t>Lack of internal skills / talent</w:t>
+      </w:r>
+    </w:p>
+    <w:p>
+      <w:pPr>
+        <w:spacing w:after="20"/>
+        <w:ind w:left="432"/>
+      </w:pPr>
+      <w:r>
+        <w:rPr>
+          <w:sz w:val="22"/>
+        </w:rPr>
+        <w:t xml:space="preserve">☐  </w:t>
+      </w:r>
+      <w:r>
+        <w:rPr>
+          <w:color w:val="333333"/>
+          <w:sz w:val="21"/>
+        </w:rPr>
+        <w:t>Unclear ROI / business case</w:t>
+      </w:r>
+    </w:p>
+    <w:p>
+      <w:pPr>
+        <w:spacing w:after="80"/>
+        <w:ind w:left="432"/>
+      </w:pPr>
+      <w:r>
+        <w:rPr>
+          <w:color w:val="333333"/>
+          <w:sz w:val="21"/>
+        </w:rPr>
+        <w:t>☐  Other (please specify): ____________________________________</w:t>
+      </w:r>
+    </w:p>
+    <w:p>
+      <w:pPr>
+        <w:spacing w:before="200" w:after="40"/>
+      </w:pPr>
+      <w:r>
+        <w:rPr>
+          <w:b/>
+          <w:color w:val="2E6DB4"/>
+          <w:sz w:val="22"/>
+        </w:rPr>
+        <w:t xml:space="preserve">Q36. </w:t>
+      </w:r>
+      <w:r>
+        <w:rPr>
+          <w:b/>
+          <w:color w:val="222222"/>
+          <w:sz w:val="22"/>
+        </w:rPr>
+        <w:t>Over the next 2–3 years, what do you expect for token prices in the market?</w:t>
+      </w:r>
+    </w:p>
+    <w:p>
+      <w:pPr>
+        <w:spacing w:after="20"/>
+        <w:ind w:left="432"/>
+      </w:pPr>
+      <w:r>
+        <w:rPr>
+          <w:sz w:val="22"/>
+        </w:rPr>
+        <w:t xml:space="preserve">☐  </w:t>
+      </w:r>
+      <w:r>
+        <w:rPr>
+          <w:color w:val="333333"/>
+          <w:sz w:val="21"/>
+        </w:rPr>
+        <w:t>Fall significantly (more than 50%)</w:t>
+      </w:r>
+    </w:p>
+    <w:p>
+      <w:pPr>
+        <w:spacing w:after="20"/>
+        <w:ind w:left="432"/>
+      </w:pPr>
+      <w:r>
+        <w:rPr>
+          <w:sz w:val="22"/>
+        </w:rPr>
+        <w:t xml:space="preserve">☐  </w:t>
+      </w:r>
+      <w:r>
+        <w:rPr>
+          <w:color w:val="333333"/>
+          <w:sz w:val="21"/>
+        </w:rPr>
+        <w:t>Fall moderately (10–50%)</w:t>
+      </w:r>
+    </w:p>
+    <w:p>
+      <w:pPr>
+        <w:spacing w:after="20"/>
+        <w:ind w:left="432"/>
+      </w:pPr>
+      <w:r>
+        <w:rPr>
+          <w:sz w:val="22"/>
+        </w:rPr>
+        <w:t xml:space="preserve">☐  </w:t>
+      </w:r>
+      <w:r>
+        <w:rPr>
+          <w:color w:val="333333"/>
+          <w:sz w:val="21"/>
+        </w:rPr>
+        <w:t>Stay roughly flat</w:t>
+      </w:r>
+    </w:p>
+    <w:p>
+      <w:pPr>
+        <w:spacing w:after="20"/>
+        <w:ind w:left="432"/>
+      </w:pPr>
+      <w:r>
+        <w:rPr>
+          <w:sz w:val="22"/>
+        </w:rPr>
+        <w:t xml:space="preserve">☐  </w:t>
+      </w:r>
+      <w:r>
+        <w:rPr>
+          <w:color w:val="333333"/>
+          <w:sz w:val="21"/>
+        </w:rPr>
+        <w:t>Rise moderately (10–50%)</w:t>
+      </w:r>
+    </w:p>
+    <w:p>
+      <w:pPr>
+        <w:spacing w:after="20"/>
+        <w:ind w:left="432"/>
+      </w:pPr>
+      <w:r>
+        <w:rPr>
+          <w:sz w:val="22"/>
+        </w:rPr>
+        <w:t xml:space="preserve">☐  </w:t>
+      </w:r>
+      <w:r>
+        <w:rPr>
+          <w:color w:val="333333"/>
+          <w:sz w:val="21"/>
+        </w:rPr>
+        <w:t>Rise significantly (more than 50%)</w:t>
+      </w:r>
+    </w:p>
+    <w:p>
+      <w:pPr>
+        <w:spacing w:after="20"/>
+        <w:ind w:left="432"/>
+      </w:pPr>
+      <w:r>
+        <w:rPr>
+          <w:sz w:val="22"/>
+        </w:rPr>
+        <w:t xml:space="preserve">☐  </w:t>
+      </w:r>
+      <w:r>
+        <w:rPr>
+          <w:color w:val="333333"/>
+          <w:sz w:val="21"/>
+        </w:rPr>
+        <w:t>No clear expectation</w:t>
+      </w:r>
+    </w:p>
+    <w:p>
+      <w:pPr>
+        <w:spacing w:before="200" w:after="40"/>
+      </w:pPr>
+      <w:r>
+        <w:rPr>
+          <w:b/>
+          <w:color w:val="2E6DB4"/>
+          <w:sz w:val="22"/>
+        </w:rPr>
+        <w:t xml:space="preserve">Q37. </w:t>
+      </w:r>
+      <w:r>
+        <w:rPr>
+          <w:b/>
+          <w:color w:val="222222"/>
+          <w:sz w:val="22"/>
+        </w:rPr>
+        <w:t>Any additional comments on your token consumption, budget, ROI, or pricing sensitivity? (optional)</w:t>
       </w:r>
     </w:p>
     <w:p>

</xml_diff>

<commit_message>
Insert Q9 on whether token consumption is ahead of expectations
Co-authored-by: ms4674 <ms4674@users.noreply.github.com>
</commit_message>
<xml_diff>
--- a/LLM_Token_Consumption_Survey.docx
+++ b/LLM_Token_Consumption_Survey.docx
@@ -1373,7 +1373,7 @@
           <w:color w:val="222222"/>
           <w:sz w:val="22"/>
         </w:rPr>
-        <w:t>Which single use case consumes the MOST tokens in your organization?</w:t>
+        <w:t>How does your token consumption compare with your original expectations?</w:t>
       </w:r>
     </w:p>
     <w:p>
@@ -1392,7 +1392,7 @@
           <w:color w:val="333333"/>
           <w:sz w:val="21"/>
         </w:rPr>
-        <w:t>Customer support / conversational agents</w:t>
+        <w:t>Significantly ahead of expectations (much higher than planned)</w:t>
       </w:r>
     </w:p>
     <w:p>
@@ -1411,7 +1411,7 @@
           <w:color w:val="333333"/>
           <w:sz w:val="21"/>
         </w:rPr>
-        <w:t>Coding &amp; software development assistants</w:t>
+        <w:t>Somewhat ahead of expectations</w:t>
       </w:r>
     </w:p>
     <w:p>
@@ -1430,7 +1430,7 @@
           <w:color w:val="333333"/>
           <w:sz w:val="21"/>
         </w:rPr>
-        <w:t>Content &amp; marketing generation</w:t>
+        <w:t>In line with expectations</w:t>
       </w:r>
     </w:p>
     <w:p>
@@ -1449,7 +1449,7 @@
           <w:color w:val="333333"/>
           <w:sz w:val="21"/>
         </w:rPr>
-        <w:t>RAG / search / knowledge retrieval</w:t>
+        <w:t>Below expectations (lower than planned)</w:t>
       </w:r>
     </w:p>
     <w:p>
@@ -1468,7 +1468,28 @@
           <w:color w:val="333333"/>
           <w:sz w:val="21"/>
         </w:rPr>
-        <w:t>Document &amp; data processing at scale</w:t>
+        <w:t>No expectations were set / don't know</w:t>
+      </w:r>
+    </w:p>
+    <w:p>
+      <w:pPr>
+        <w:spacing w:before="200" w:after="40"/>
+      </w:pPr>
+      <w:r>
+        <w:rPr>
+          <w:b/>
+          <w:color w:val="2E6DB4"/>
+          <w:sz w:val="22"/>
+        </w:rPr>
+        <w:t xml:space="preserve">Q10. </w:t>
+      </w:r>
+      <w:r>
+        <w:rPr>
+          <w:b/>
+          <w:color w:val="222222"/>
+          <w:sz w:val="22"/>
+        </w:rPr>
+        <w:t>Which single use case consumes the MOST tokens in your organization?</w:t>
       </w:r>
     </w:p>
     <w:p>
@@ -1487,6 +1508,101 @@
           <w:color w:val="333333"/>
           <w:sz w:val="21"/>
         </w:rPr>
+        <w:t>Customer support / conversational agents</w:t>
+      </w:r>
+    </w:p>
+    <w:p>
+      <w:pPr>
+        <w:spacing w:after="20"/>
+        <w:ind w:left="432"/>
+      </w:pPr>
+      <w:r>
+        <w:rPr>
+          <w:sz w:val="22"/>
+        </w:rPr>
+        <w:t xml:space="preserve">☐  </w:t>
+      </w:r>
+      <w:r>
+        <w:rPr>
+          <w:color w:val="333333"/>
+          <w:sz w:val="21"/>
+        </w:rPr>
+        <w:t>Coding &amp; software development assistants</w:t>
+      </w:r>
+    </w:p>
+    <w:p>
+      <w:pPr>
+        <w:spacing w:after="20"/>
+        <w:ind w:left="432"/>
+      </w:pPr>
+      <w:r>
+        <w:rPr>
+          <w:sz w:val="22"/>
+        </w:rPr>
+        <w:t xml:space="preserve">☐  </w:t>
+      </w:r>
+      <w:r>
+        <w:rPr>
+          <w:color w:val="333333"/>
+          <w:sz w:val="21"/>
+        </w:rPr>
+        <w:t>Content &amp; marketing generation</w:t>
+      </w:r>
+    </w:p>
+    <w:p>
+      <w:pPr>
+        <w:spacing w:after="20"/>
+        <w:ind w:left="432"/>
+      </w:pPr>
+      <w:r>
+        <w:rPr>
+          <w:sz w:val="22"/>
+        </w:rPr>
+        <w:t xml:space="preserve">☐  </w:t>
+      </w:r>
+      <w:r>
+        <w:rPr>
+          <w:color w:val="333333"/>
+          <w:sz w:val="21"/>
+        </w:rPr>
+        <w:t>RAG / search / knowledge retrieval</w:t>
+      </w:r>
+    </w:p>
+    <w:p>
+      <w:pPr>
+        <w:spacing w:after="20"/>
+        <w:ind w:left="432"/>
+      </w:pPr>
+      <w:r>
+        <w:rPr>
+          <w:sz w:val="22"/>
+        </w:rPr>
+        <w:t xml:space="preserve">☐  </w:t>
+      </w:r>
+      <w:r>
+        <w:rPr>
+          <w:color w:val="333333"/>
+          <w:sz w:val="21"/>
+        </w:rPr>
+        <w:t>Document &amp; data processing at scale</w:t>
+      </w:r>
+    </w:p>
+    <w:p>
+      <w:pPr>
+        <w:spacing w:after="20"/>
+        <w:ind w:left="432"/>
+      </w:pPr>
+      <w:r>
+        <w:rPr>
+          <w:sz w:val="22"/>
+        </w:rPr>
+        <w:t xml:space="preserve">☐  </w:t>
+      </w:r>
+      <w:r>
+        <w:rPr>
+          <w:color w:val="333333"/>
+          <w:sz w:val="21"/>
+        </w:rPr>
         <w:t>Agentic / multi-step automation workflows</w:t>
       </w:r>
     </w:p>
@@ -1513,7 +1629,7 @@
           <w:color w:val="2E6DB4"/>
           <w:sz w:val="22"/>
         </w:rPr>
-        <w:t xml:space="preserve">Q10. </w:t>
+        <w:t xml:space="preserve">Q11. </w:t>
       </w:r>
       <w:r>
         <w:rPr>
@@ -1642,7 +1758,7 @@
           <w:color w:val="2E6DB4"/>
           <w:sz w:val="22"/>
         </w:rPr>
-        <w:t xml:space="preserve">Q11. </w:t>
+        <w:t xml:space="preserve">Q12. </w:t>
       </w:r>
       <w:r>
         <w:rPr>
@@ -1806,7 +1922,7 @@
           <w:color w:val="2E6DB4"/>
           <w:sz w:val="22"/>
         </w:rPr>
-        <w:t xml:space="preserve">Q12. </w:t>
+        <w:t xml:space="preserve">Q13. </w:t>
       </w:r>
       <w:r>
         <w:rPr>
@@ -1960,7 +2076,7 @@
           <w:color w:val="2E6DB4"/>
           <w:sz w:val="22"/>
         </w:rPr>
-        <w:t xml:space="preserve">Q13. </w:t>
+        <w:t xml:space="preserve">Q14. </w:t>
       </w:r>
       <w:r>
         <w:rPr>
@@ -2159,7 +2275,7 @@
           <w:color w:val="2E6DB4"/>
           <w:sz w:val="22"/>
         </w:rPr>
-        <w:t xml:space="preserve">Q14. </w:t>
+        <w:t xml:space="preserve">Q15. </w:t>
       </w:r>
       <w:r>
         <w:rPr>
@@ -2307,7 +2423,7 @@
           <w:color w:val="2E6DB4"/>
           <w:sz w:val="22"/>
         </w:rPr>
-        <w:t xml:space="preserve">Q15. </w:t>
+        <w:t xml:space="preserve">Q16. </w:t>
       </w:r>
       <w:r>
         <w:rPr>
@@ -2452,7 +2568,7 @@
           <w:color w:val="2E6DB4"/>
           <w:sz w:val="22"/>
         </w:rPr>
-        <w:t xml:space="preserve">Q16. </w:t>
+        <w:t xml:space="preserve">Q17. </w:t>
       </w:r>
       <w:r>
         <w:rPr>
@@ -3497,7 +3613,7 @@
           <w:color w:val="2E6DB4"/>
           <w:sz w:val="22"/>
         </w:rPr>
-        <w:t xml:space="preserve">Q17. </w:t>
+        <w:t xml:space="preserve">Q18. </w:t>
       </w:r>
       <w:r>
         <w:rPr>
@@ -3651,7 +3767,7 @@
           <w:color w:val="2E6DB4"/>
           <w:sz w:val="22"/>
         </w:rPr>
-        <w:t xml:space="preserve">Q18. </w:t>
+        <w:t xml:space="preserve">Q19. </w:t>
       </w:r>
       <w:r>
         <w:rPr>
@@ -3786,7 +3902,7 @@
           <w:color w:val="2E6DB4"/>
           <w:sz w:val="22"/>
         </w:rPr>
-        <w:t xml:space="preserve">Q19. </w:t>
+        <w:t xml:space="preserve">Q20. </w:t>
       </w:r>
       <w:r>
         <w:rPr>
@@ -3940,7 +4056,7 @@
           <w:color w:val="2E6DB4"/>
           <w:sz w:val="22"/>
         </w:rPr>
-        <w:t xml:space="preserve">Q20. </w:t>
+        <w:t xml:space="preserve">Q21. </w:t>
       </w:r>
       <w:r>
         <w:rPr>
@@ -4155,7 +4271,7 @@
           <w:color w:val="2E6DB4"/>
           <w:sz w:val="22"/>
         </w:rPr>
-        <w:t xml:space="preserve">Q21. </w:t>
+        <w:t xml:space="preserve">Q22. </w:t>
       </w:r>
       <w:r>
         <w:rPr>
@@ -4309,7 +4425,7 @@
           <w:color w:val="2E6DB4"/>
           <w:sz w:val="22"/>
         </w:rPr>
-        <w:t xml:space="preserve">Q22. </w:t>
+        <w:t xml:space="preserve">Q23. </w:t>
       </w:r>
       <w:r>
         <w:rPr>
@@ -4438,7 +4554,7 @@
           <w:color w:val="2E6DB4"/>
           <w:sz w:val="22"/>
         </w:rPr>
-        <w:t xml:space="preserve">Q23. </w:t>
+        <w:t xml:space="preserve">Q24. </w:t>
       </w:r>
       <w:r>
         <w:rPr>
@@ -4573,7 +4689,7 @@
           <w:color w:val="2E6DB4"/>
           <w:sz w:val="22"/>
         </w:rPr>
-        <w:t xml:space="preserve">Q24. </w:t>
+        <w:t xml:space="preserve">Q25. </w:t>
       </w:r>
       <w:r>
         <w:rPr>
@@ -4708,7 +4824,7 @@
           <w:color w:val="2E6DB4"/>
           <w:sz w:val="22"/>
         </w:rPr>
-        <w:t xml:space="preserve">Q25. </w:t>
+        <w:t xml:space="preserve">Q26. </w:t>
       </w:r>
       <w:r>
         <w:rPr>
@@ -5021,7 +5137,7 @@
           <w:color w:val="2E6DB4"/>
           <w:sz w:val="22"/>
         </w:rPr>
-        <w:t xml:space="preserve">Q26. </w:t>
+        <w:t xml:space="preserve">Q27. </w:t>
       </w:r>
       <w:r>
         <w:rPr>
@@ -5249,7 +5365,7 @@
           <w:color w:val="2E6DB4"/>
           <w:sz w:val="22"/>
         </w:rPr>
-        <w:t xml:space="preserve">Q27. </w:t>
+        <w:t xml:space="preserve">Q28. </w:t>
       </w:r>
       <w:r>
         <w:rPr>
@@ -5365,7 +5481,7 @@
           <w:color w:val="2E6DB4"/>
           <w:sz w:val="22"/>
         </w:rPr>
-        <w:t xml:space="preserve">Q28. </w:t>
+        <w:t xml:space="preserve">Q29. </w:t>
       </w:r>
       <w:r>
         <w:rPr>
@@ -5500,7 +5616,7 @@
           <w:color w:val="2E6DB4"/>
           <w:sz w:val="22"/>
         </w:rPr>
-        <w:t xml:space="preserve">Q29. </w:t>
+        <w:t xml:space="preserve">Q30. </w:t>
       </w:r>
       <w:r>
         <w:rPr>
@@ -5616,7 +5732,7 @@
           <w:color w:val="2E6DB4"/>
           <w:sz w:val="22"/>
         </w:rPr>
-        <w:t xml:space="preserve">Q30. </w:t>
+        <w:t xml:space="preserve">Q31. </w:t>
       </w:r>
       <w:r>
         <w:rPr>
@@ -5796,7 +5912,7 @@
           <w:color w:val="2E6DB4"/>
           <w:sz w:val="22"/>
         </w:rPr>
-        <w:t xml:space="preserve">Q31. </w:t>
+        <w:t xml:space="preserve">Q32. </w:t>
       </w:r>
       <w:r>
         <w:rPr>
@@ -5931,7 +6047,7 @@
           <w:color w:val="2E6DB4"/>
           <w:sz w:val="22"/>
         </w:rPr>
-        <w:t xml:space="preserve">Q32. </w:t>
+        <w:t xml:space="preserve">Q33. </w:t>
       </w:r>
       <w:r>
         <w:rPr>
@@ -6076,7 +6192,7 @@
           <w:color w:val="2E6DB4"/>
           <w:sz w:val="22"/>
         </w:rPr>
-        <w:t xml:space="preserve">Q33. </w:t>
+        <w:t xml:space="preserve">Q34. </w:t>
       </w:r>
       <w:r>
         <w:rPr>
@@ -6211,7 +6327,7 @@
           <w:color w:val="2E6DB4"/>
           <w:sz w:val="22"/>
         </w:rPr>
-        <w:t xml:space="preserve">Q34. </w:t>
+        <w:t xml:space="preserve">Q35. </w:t>
       </w:r>
       <w:r>
         <w:rPr>
@@ -6445,7 +6561,7 @@
           <w:color w:val="2E6DB4"/>
           <w:sz w:val="22"/>
         </w:rPr>
-        <w:t xml:space="preserve">Q35. </w:t>
+        <w:t xml:space="preserve">Q36. </w:t>
       </w:r>
       <w:r>
         <w:rPr>
@@ -6593,7 +6709,7 @@
           <w:color w:val="2E6DB4"/>
           <w:sz w:val="22"/>
         </w:rPr>
-        <w:t xml:space="preserve">Q36. </w:t>
+        <w:t xml:space="preserve">Q37. </w:t>
       </w:r>
       <w:r>
         <w:rPr>
@@ -6728,7 +6844,7 @@
           <w:color w:val="2E6DB4"/>
           <w:sz w:val="22"/>
         </w:rPr>
-        <w:t xml:space="preserve">Q37. </w:t>
+        <w:t xml:space="preserve">Q38. </w:t>
       </w:r>
       <w:r>
         <w:rPr>

</xml_diff>